<commit_message>
Design doc rewritten for readers new to FPGAs (basics, every module with real code, rebuild steps, full source + Vivado schematics appendices); new data-flow, FSM and flash figures; chaos-on and face screenshots
</commit_message>
<xml_diff>
--- a/submission/2.1_Proposal/Proposal.docx
+++ b/submission/2.1_Proposal/Proposal.docx
@@ -48,7 +48,7 @@
       <w:tr>
         <w:tc>
           <w:tcPr>
-            <w:tcW w:type="dxa" w:w="1816"/>
+            <w:tcW w:type="dxa" w:w="2614"/>
             <w:shd w:val="clear" w:color="auto" w:fill="EDE9FE"/>
           </w:tcPr>
           <w:p>
@@ -69,7 +69,7 @@
         </w:tc>
         <w:tc>
           <w:tcPr>
-            <w:tcW w:type="dxa" w:w="4623"/>
+            <w:tcW w:type="dxa" w:w="4183"/>
             <w:shd w:val="clear" w:color="auto" w:fill="EDE9FE"/>
           </w:tcPr>
           <w:p>
@@ -90,7 +90,7 @@
         </w:tc>
         <w:tc>
           <w:tcPr>
-            <w:tcW w:type="dxa" w:w="2972"/>
+            <w:tcW w:type="dxa" w:w="2614"/>
             <w:shd w:val="clear" w:color="auto" w:fill="EDE9FE"/>
           </w:tcPr>
           <w:p>
@@ -113,7 +113,7 @@
       <w:tr>
         <w:tc>
           <w:tcPr>
-            <w:tcW w:type="dxa" w:w="1816"/>
+            <w:tcW w:type="dxa" w:w="2614"/>
           </w:tcPr>
           <w:p>
             <w:pPr>
@@ -131,7 +131,7 @@
         </w:tc>
         <w:tc>
           <w:tcPr>
-            <w:tcW w:type="dxa" w:w="4623"/>
+            <w:tcW w:type="dxa" w:w="4183"/>
           </w:tcPr>
           <w:p>
             <w:pPr>
@@ -143,13 +143,13 @@
                 <w:sz w:val="20"/>
                 <w:szCs w:val="20"/>
               </w:rPr>
-              <w:t>[ชื่อ-นามสกุล]</w:t>
+              <w:t>ธีรนัย ธรรมเพชร</w:t>
             </w:r>
           </w:p>
         </w:tc>
         <w:tc>
           <w:tcPr>
-            <w:tcW w:type="dxa" w:w="2972"/>
+            <w:tcW w:type="dxa" w:w="2614"/>
           </w:tcPr>
           <w:p>
             <w:pPr>
@@ -161,7 +161,7 @@
                 <w:sz w:val="20"/>
                 <w:szCs w:val="20"/>
               </w:rPr>
-              <w:t>[รหัส]</w:t>
+              <w:t>68010542</w:t>
             </w:r>
           </w:p>
         </w:tc>
@@ -169,7 +169,7 @@
       <w:tr>
         <w:tc>
           <w:tcPr>
-            <w:tcW w:type="dxa" w:w="1816"/>
+            <w:tcW w:type="dxa" w:w="2614"/>
           </w:tcPr>
           <w:p>
             <w:pPr>
@@ -187,7 +187,7 @@
         </w:tc>
         <w:tc>
           <w:tcPr>
-            <w:tcW w:type="dxa" w:w="4623"/>
+            <w:tcW w:type="dxa" w:w="4183"/>
           </w:tcPr>
           <w:p>
             <w:pPr>
@@ -199,13 +199,13 @@
                 <w:sz w:val="20"/>
                 <w:szCs w:val="20"/>
               </w:rPr>
-              <w:t>[ชื่อ-นามสกุล]</w:t>
+              <w:t>นนธพัชร์ น้อยสวัสดิ์</w:t>
             </w:r>
           </w:p>
         </w:tc>
         <w:tc>
           <w:tcPr>
-            <w:tcW w:type="dxa" w:w="2972"/>
+            <w:tcW w:type="dxa" w:w="2614"/>
           </w:tcPr>
           <w:p>
             <w:pPr>
@@ -217,7 +217,7 @@
                 <w:sz w:val="20"/>
                 <w:szCs w:val="20"/>
               </w:rPr>
-              <w:t>[รหัส]</w:t>
+              <w:t>68010558</w:t>
             </w:r>
           </w:p>
         </w:tc>
@@ -225,7 +225,7 @@
       <w:tr>
         <w:tc>
           <w:tcPr>
-            <w:tcW w:type="dxa" w:w="1816"/>
+            <w:tcW w:type="dxa" w:w="2614"/>
           </w:tcPr>
           <w:p>
             <w:pPr>
@@ -243,7 +243,7 @@
         </w:tc>
         <w:tc>
           <w:tcPr>
-            <w:tcW w:type="dxa" w:w="4623"/>
+            <w:tcW w:type="dxa" w:w="4183"/>
           </w:tcPr>
           <w:p>
             <w:pPr>
@@ -255,13 +255,13 @@
                 <w:sz w:val="20"/>
                 <w:szCs w:val="20"/>
               </w:rPr>
-              <w:t>[ชื่อ-นามสกุล]</w:t>
+              <w:t>พิสิษฐ์ ปัญคิวจณาณ์</w:t>
             </w:r>
           </w:p>
         </w:tc>
         <w:tc>
           <w:tcPr>
-            <w:tcW w:type="dxa" w:w="2972"/>
+            <w:tcW w:type="dxa" w:w="2614"/>
           </w:tcPr>
           <w:p>
             <w:pPr>
@@ -273,7 +273,7 @@
                 <w:sz w:val="20"/>
                 <w:szCs w:val="20"/>
               </w:rPr>
-              <w:t>[รหัส]</w:t>
+              <w:t>68010798</w:t>
             </w:r>
           </w:p>
         </w:tc>
@@ -281,7 +281,7 @@
       <w:tr>
         <w:tc>
           <w:tcPr>
-            <w:tcW w:type="dxa" w:w="1816"/>
+            <w:tcW w:type="dxa" w:w="2614"/>
           </w:tcPr>
           <w:p>
             <w:pPr>
@@ -299,7 +299,7 @@
         </w:tc>
         <w:tc>
           <w:tcPr>
-            <w:tcW w:type="dxa" w:w="4623"/>
+            <w:tcW w:type="dxa" w:w="4183"/>
           </w:tcPr>
           <w:p>
             <w:pPr>
@@ -311,13 +311,13 @@
                 <w:sz w:val="20"/>
                 <w:szCs w:val="20"/>
               </w:rPr>
-              <w:t>[ชื่อ-นามสกุล]</w:t>
+              <w:t>อนาคม อเล็กซองดรู สุวรรณวร</w:t>
             </w:r>
           </w:p>
         </w:tc>
         <w:tc>
           <w:tcPr>
-            <w:tcW w:type="dxa" w:w="2972"/>
+            <w:tcW w:type="dxa" w:w="2614"/>
           </w:tcPr>
           <w:p>
             <w:pPr>
@@ -329,7 +329,7 @@
                 <w:sz w:val="20"/>
                 <w:szCs w:val="20"/>
               </w:rPr>
-              <w:t>[รหัส]</w:t>
+              <w:t>68011217</w:t>
             </w:r>
           </w:p>
         </w:tc>
@@ -337,7 +337,7 @@
       <w:tr>
         <w:tc>
           <w:tcPr>
-            <w:tcW w:type="dxa" w:w="1816"/>
+            <w:tcW w:type="dxa" w:w="2614"/>
           </w:tcPr>
           <w:p>
             <w:pPr>
@@ -355,7 +355,7 @@
         </w:tc>
         <w:tc>
           <w:tcPr>
-            <w:tcW w:type="dxa" w:w="4623"/>
+            <w:tcW w:type="dxa" w:w="4183"/>
           </w:tcPr>
           <w:p>
             <w:pPr>
@@ -367,13 +367,13 @@
                 <w:sz w:val="20"/>
                 <w:szCs w:val="20"/>
               </w:rPr>
-              <w:t>[ชื่อ-นามสกุล (ถ้ามี)]</w:t>
+              <w:t>ชนกภูมิ สันติอัศวราภรณ์</w:t>
             </w:r>
           </w:p>
         </w:tc>
         <w:tc>
           <w:tcPr>
-            <w:tcW w:type="dxa" w:w="2972"/>
+            <w:tcW w:type="dxa" w:w="2614"/>
           </w:tcPr>
           <w:p>
             <w:pPr>
@@ -385,63 +385,7 @@
                 <w:sz w:val="20"/>
                 <w:szCs w:val="20"/>
               </w:rPr>
-              <w:t>[รหัส]</w:t>
-            </w:r>
-          </w:p>
-        </w:tc>
-      </w:tr>
-      <w:tr>
-        <w:tc>
-          <w:tcPr>
-            <w:tcW w:type="dxa" w:w="1816"/>
-          </w:tcPr>
-          <w:p>
-            <w:pPr>
-              <w:spacing w:after="0"/>
-            </w:pPr>
-            <w:r>
-              <w:rPr>
-                <w:rFonts w:ascii="Sarabun" w:hAnsi="Sarabun" w:cs="Sarabun" w:eastAsia="Sarabun"/>
-                <w:sz w:val="20"/>
-                <w:szCs w:val="20"/>
-              </w:rPr>
-              <w:t>6</w:t>
-            </w:r>
-          </w:p>
-        </w:tc>
-        <w:tc>
-          <w:tcPr>
-            <w:tcW w:type="dxa" w:w="4623"/>
-          </w:tcPr>
-          <w:p>
-            <w:pPr>
-              <w:spacing w:after="0"/>
-            </w:pPr>
-            <w:r>
-              <w:rPr>
-                <w:rFonts w:ascii="Sarabun" w:hAnsi="Sarabun" w:cs="Sarabun" w:eastAsia="Sarabun"/>
-                <w:sz w:val="20"/>
-                <w:szCs w:val="20"/>
-              </w:rPr>
-              <w:t>[ชื่อ-นามสกุล (ถ้ามี)]</w:t>
-            </w:r>
-          </w:p>
-        </w:tc>
-        <w:tc>
-          <w:tcPr>
-            <w:tcW w:type="dxa" w:w="2972"/>
-          </w:tcPr>
-          <w:p>
-            <w:pPr>
-              <w:spacing w:after="0"/>
-            </w:pPr>
-            <w:r>
-              <w:rPr>
-                <w:rFonts w:ascii="Sarabun" w:hAnsi="Sarabun" w:cs="Sarabun" w:eastAsia="Sarabun"/>
-                <w:sz w:val="20"/>
-                <w:szCs w:val="20"/>
-              </w:rPr>
-              <w:t>[รหัส]</w:t>
+              <w:t>68011641</w:t>
             </w:r>
           </w:p>
         </w:tc>
@@ -682,6 +626,10 @@
     <w:p>
       <w:pPr>
         <w:pStyle w:val="ListNumber"/>
+        <w:numPr>
+          <w:ilvl w:val="0"/>
+          <w:numId w:val="10"/>
+        </w:numPr>
         <w:spacing w:after="40"/>
       </w:pPr>
       <w:r>
@@ -708,6 +656,10 @@
     <w:p>
       <w:pPr>
         <w:pStyle w:val="ListNumber"/>
+        <w:numPr>
+          <w:ilvl w:val="0"/>
+          <w:numId w:val="10"/>
+        </w:numPr>
         <w:spacing w:after="40"/>
       </w:pPr>
       <w:r>
@@ -720,6 +672,10 @@
     <w:p>
       <w:pPr>
         <w:pStyle w:val="ListNumber"/>
+        <w:numPr>
+          <w:ilvl w:val="0"/>
+          <w:numId w:val="10"/>
+        </w:numPr>
         <w:spacing w:after="40"/>
       </w:pPr>
       <w:r>
@@ -732,6 +688,10 @@
     <w:p>
       <w:pPr>
         <w:pStyle w:val="ListNumber"/>
+        <w:numPr>
+          <w:ilvl w:val="0"/>
+          <w:numId w:val="10"/>
+        </w:numPr>
         <w:spacing w:after="40"/>
       </w:pPr>
       <w:r>
@@ -744,6 +704,10 @@
     <w:p>
       <w:pPr>
         <w:pStyle w:val="ListNumber"/>
+        <w:numPr>
+          <w:ilvl w:val="0"/>
+          <w:numId w:val="10"/>
+        </w:numPr>
         <w:spacing w:after="40"/>
       </w:pPr>
       <w:r>
@@ -862,6 +826,10 @@
     <w:p>
       <w:pPr>
         <w:pStyle w:val="ListNumber"/>
+        <w:numPr>
+          <w:ilvl w:val="0"/>
+          <w:numId w:val="11"/>
+        </w:numPr>
         <w:spacing w:after="40"/>
       </w:pPr>
       <w:r>
@@ -874,6 +842,10 @@
     <w:p>
       <w:pPr>
         <w:pStyle w:val="ListNumber"/>
+        <w:numPr>
+          <w:ilvl w:val="0"/>
+          <w:numId w:val="11"/>
+        </w:numPr>
         <w:spacing w:after="40"/>
       </w:pPr>
       <w:r>
@@ -886,6 +858,10 @@
     <w:p>
       <w:pPr>
         <w:pStyle w:val="ListNumber"/>
+        <w:numPr>
+          <w:ilvl w:val="0"/>
+          <w:numId w:val="11"/>
+        </w:numPr>
         <w:spacing w:after="40"/>
       </w:pPr>
       <w:r>
@@ -898,6 +874,10 @@
     <w:p>
       <w:pPr>
         <w:pStyle w:val="ListNumber"/>
+        <w:numPr>
+          <w:ilvl w:val="0"/>
+          <w:numId w:val="11"/>
+        </w:numPr>
         <w:spacing w:after="40"/>
       </w:pPr>
       <w:r>
@@ -910,6 +890,10 @@
     <w:p>
       <w:pPr>
         <w:pStyle w:val="ListNumber"/>
+        <w:numPr>
+          <w:ilvl w:val="0"/>
+          <w:numId w:val="11"/>
+        </w:numPr>
         <w:spacing w:after="40"/>
       </w:pPr>
       <w:r>
@@ -932,6 +916,10 @@
     <w:p>
       <w:pPr>
         <w:pStyle w:val="ListNumber"/>
+        <w:numPr>
+          <w:ilvl w:val="0"/>
+          <w:numId w:val="12"/>
+        </w:numPr>
         <w:spacing w:after="40"/>
       </w:pPr>
       <w:r>
@@ -944,6 +932,10 @@
     <w:p>
       <w:pPr>
         <w:pStyle w:val="ListNumber"/>
+        <w:numPr>
+          <w:ilvl w:val="0"/>
+          <w:numId w:val="12"/>
+        </w:numPr>
         <w:spacing w:after="40"/>
       </w:pPr>
       <w:r>
@@ -956,6 +948,10 @@
     <w:p>
       <w:pPr>
         <w:pStyle w:val="ListNumber"/>
+        <w:numPr>
+          <w:ilvl w:val="0"/>
+          <w:numId w:val="12"/>
+        </w:numPr>
         <w:spacing w:after="40"/>
       </w:pPr>
       <w:r>
@@ -968,6 +964,10 @@
     <w:p>
       <w:pPr>
         <w:pStyle w:val="ListNumber"/>
+        <w:numPr>
+          <w:ilvl w:val="0"/>
+          <w:numId w:val="12"/>
+        </w:numPr>
         <w:spacing w:after="40"/>
       </w:pPr>
       <w:r>
@@ -980,6 +980,10 @@
     <w:p>
       <w:pPr>
         <w:pStyle w:val="ListNumber"/>
+        <w:numPr>
+          <w:ilvl w:val="0"/>
+          <w:numId w:val="12"/>
+        </w:numPr>
         <w:spacing w:after="40"/>
       </w:pPr>
       <w:r>
@@ -1002,6 +1006,10 @@
     <w:p>
       <w:pPr>
         <w:pStyle w:val="ListNumber"/>
+        <w:numPr>
+          <w:ilvl w:val="0"/>
+          <w:numId w:val="13"/>
+        </w:numPr>
         <w:spacing w:after="40"/>
       </w:pPr>
       <w:r>
@@ -1014,13 +1022,17 @@
     <w:p>
       <w:pPr>
         <w:pStyle w:val="ListNumber"/>
+        <w:numPr>
+          <w:ilvl w:val="0"/>
+          <w:numId w:val="13"/>
+        </w:numPr>
         <w:spacing w:after="40"/>
       </w:pPr>
       <w:r>
         <w:rPr>
           <w:rFonts w:ascii="Sarabun" w:hAnsi="Sarabun" w:cs="Sarabun" w:eastAsia="Sarabun"/>
         </w:rPr>
-        <w:t xml:space="preserve">ทำภารกิจสำเร็จ → </w:t>
+        <w:t xml:space="preserve">ทำภารกิจสำเร็จ → สุ่ม: โอกาส 62.5 % (5 ใน 8) ได้ </w:t>
       </w:r>
       <w:r>
         <w:rPr>
@@ -1034,7 +1046,7 @@
         <w:rPr>
           <w:rFonts w:ascii="Sarabun" w:hAnsi="Sarabun" w:cs="Sarabun" w:eastAsia="Sarabun"/>
         </w:rPr>
-        <w:t xml:space="preserve"> คู่แข่ง (11 แบบ: MIRROR, FLIP, BLIND, BOUNCERS, +3 GARBAGE, CURSED, SPEED, LOCK และวิดีโอ 3 แบบ) หรือได้ </w:t>
+        <w:t xml:space="preserve"> คู่แข่ง (11 แบบ: MIRROR, FLIP, BLIND, BOUNCERS, +3 GARBAGE, CURSED, SPEED, LOCK และวิดีโอ 3 แบบ) และโอกาส 37.5 % (3 ใน 8) ได้ </w:t>
       </w:r>
       <w:r>
         <w:rPr>
@@ -1048,7 +1060,7 @@
         <w:rPr>
           <w:rFonts w:ascii="Sarabun" w:hAnsi="Sarabun" w:cs="Sarabun" w:eastAsia="Sarabun"/>
         </w:rPr>
-        <w:t xml:space="preserve"> (FREEZE, SINK, I-PIECE)</w:t>
+        <w:t xml:space="preserve"> ให้ตัวเอง (3 แบบ: FREEZE, SINK, I-PIECE; ถ้าไม่ได้ต่อบอร์ดจะได้โบนัสเสมอ)</w:t>
       </w:r>
     </w:p>
     <w:p>
@@ -1064,6 +1076,10 @@
     <w:p>
       <w:pPr>
         <w:pStyle w:val="ListNumber"/>
+        <w:numPr>
+          <w:ilvl w:val="0"/>
+          <w:numId w:val="14"/>
+        </w:numPr>
         <w:spacing w:after="40"/>
       </w:pPr>
       <w:r>
@@ -1076,6 +1092,10 @@
     <w:p>
       <w:pPr>
         <w:pStyle w:val="ListNumber"/>
+        <w:numPr>
+          <w:ilvl w:val="0"/>
+          <w:numId w:val="14"/>
+        </w:numPr>
         <w:spacing w:after="40"/>
       </w:pPr>
       <w:r>
@@ -1088,6 +1108,10 @@
     <w:p>
       <w:pPr>
         <w:pStyle w:val="ListNumber"/>
+        <w:numPr>
+          <w:ilvl w:val="0"/>
+          <w:numId w:val="14"/>
+        </w:numPr>
         <w:spacing w:after="40"/>
       </w:pPr>
       <w:r>
@@ -1100,6 +1124,10 @@
     <w:p>
       <w:pPr>
         <w:pStyle w:val="ListNumber"/>
+        <w:numPr>
+          <w:ilvl w:val="0"/>
+          <w:numId w:val="14"/>
+        </w:numPr>
         <w:spacing w:after="40"/>
       </w:pPr>
       <w:r>
@@ -1245,7 +1273,7 @@
       <w:tr>
         <w:tc>
           <w:tcPr>
-            <w:tcW w:type="dxa" w:w="4611"/>
+            <w:tcW w:type="dxa" w:w="4183"/>
             <w:shd w:val="clear" w:color="auto" w:fill="EDE9FE"/>
           </w:tcPr>
           <w:p>
@@ -1266,7 +1294,7 @@
         </w:tc>
         <w:tc>
           <w:tcPr>
-            <w:tcW w:type="dxa" w:w="1035"/>
+            <w:tcW w:type="dxa" w:w="1743"/>
             <w:shd w:val="clear" w:color="auto" w:fill="EDE9FE"/>
           </w:tcPr>
           <w:p>
@@ -1287,7 +1315,7 @@
         </w:tc>
         <w:tc>
           <w:tcPr>
-            <w:tcW w:type="dxa" w:w="3764"/>
+            <w:tcW w:type="dxa" w:w="3486"/>
             <w:shd w:val="clear" w:color="auto" w:fill="EDE9FE"/>
           </w:tcPr>
           <w:p>
@@ -1310,7 +1338,7 @@
       <w:tr>
         <w:tc>
           <w:tcPr>
-            <w:tcW w:type="dxa" w:w="4611"/>
+            <w:tcW w:type="dxa" w:w="4183"/>
           </w:tcPr>
           <w:p>
             <w:pPr>
@@ -1328,7 +1356,7 @@
         </w:tc>
         <w:tc>
           <w:tcPr>
-            <w:tcW w:type="dxa" w:w="1035"/>
+            <w:tcW w:type="dxa" w:w="1743"/>
           </w:tcPr>
           <w:p>
             <w:pPr>
@@ -1346,7 +1374,7 @@
         </w:tc>
         <w:tc>
           <w:tcPr>
-            <w:tcW w:type="dxa" w:w="3764"/>
+            <w:tcW w:type="dxa" w:w="3486"/>
           </w:tcPr>
           <w:p>
             <w:pPr>
@@ -1366,7 +1394,7 @@
       <w:tr>
         <w:tc>
           <w:tcPr>
-            <w:tcW w:type="dxa" w:w="4611"/>
+            <w:tcW w:type="dxa" w:w="4183"/>
           </w:tcPr>
           <w:p>
             <w:pPr>
@@ -1384,7 +1412,7 @@
         </w:tc>
         <w:tc>
           <w:tcPr>
-            <w:tcW w:type="dxa" w:w="1035"/>
+            <w:tcW w:type="dxa" w:w="1743"/>
           </w:tcPr>
           <w:p>
             <w:pPr>
@@ -1402,7 +1430,7 @@
         </w:tc>
         <w:tc>
           <w:tcPr>
-            <w:tcW w:type="dxa" w:w="3764"/>
+            <w:tcW w:type="dxa" w:w="3486"/>
           </w:tcPr>
           <w:p>
             <w:pPr>
@@ -1422,7 +1450,7 @@
       <w:tr>
         <w:tc>
           <w:tcPr>
-            <w:tcW w:type="dxa" w:w="4611"/>
+            <w:tcW w:type="dxa" w:w="4183"/>
           </w:tcPr>
           <w:p>
             <w:pPr>
@@ -1440,7 +1468,7 @@
         </w:tc>
         <w:tc>
           <w:tcPr>
-            <w:tcW w:type="dxa" w:w="1035"/>
+            <w:tcW w:type="dxa" w:w="1743"/>
           </w:tcPr>
           <w:p>
             <w:pPr>
@@ -1458,7 +1486,7 @@
         </w:tc>
         <w:tc>
           <w:tcPr>
-            <w:tcW w:type="dxa" w:w="3764"/>
+            <w:tcW w:type="dxa" w:w="3486"/>
           </w:tcPr>
           <w:p>
             <w:pPr>
@@ -1478,7 +1506,7 @@
       <w:tr>
         <w:tc>
           <w:tcPr>
-            <w:tcW w:type="dxa" w:w="4611"/>
+            <w:tcW w:type="dxa" w:w="4183"/>
           </w:tcPr>
           <w:p>
             <w:pPr>
@@ -1490,13 +1518,13 @@
                 <w:sz w:val="20"/>
                 <w:szCs w:val="20"/>
               </w:rPr>
-              <w:t>สายจัมเปอร์ 3 เส้น + ตัวต้านทาน 330 Ω 2 ตัว</w:t>
+              <w:t>สายจัมเปอร์ตัวเมีย-ตัวเมีย 3 เส้น</w:t>
             </w:r>
           </w:p>
         </w:tc>
         <w:tc>
           <w:tcPr>
-            <w:tcW w:type="dxa" w:w="1035"/>
+            <w:tcW w:type="dxa" w:w="1743"/>
           </w:tcPr>
           <w:p>
             <w:pPr>
@@ -1514,7 +1542,7 @@
         </w:tc>
         <w:tc>
           <w:tcPr>
-            <w:tcW w:type="dxa" w:w="3764"/>
+            <w:tcW w:type="dxa" w:w="3486"/>
           </w:tcPr>
           <w:p>
             <w:pPr>
@@ -1534,7 +1562,7 @@
       <w:tr>
         <w:tc>
           <w:tcPr>
-            <w:tcW w:type="dxa" w:w="4611"/>
+            <w:tcW w:type="dxa" w:w="4183"/>
           </w:tcPr>
           <w:p>
             <w:pPr>
@@ -1552,7 +1580,7 @@
         </w:tc>
         <w:tc>
           <w:tcPr>
-            <w:tcW w:type="dxa" w:w="1035"/>
+            <w:tcW w:type="dxa" w:w="1743"/>
           </w:tcPr>
           <w:p>
             <w:pPr>
@@ -1570,7 +1598,7 @@
         </w:tc>
         <w:tc>
           <w:tcPr>
-            <w:tcW w:type="dxa" w:w="3764"/>
+            <w:tcW w:type="dxa" w:w="3486"/>
           </w:tcPr>
           <w:p>
             <w:pPr>
@@ -1815,6 +1843,10 @@
     <w:p>
       <w:pPr>
         <w:pStyle w:val="ListNumber"/>
+        <w:numPr>
+          <w:ilvl w:val="0"/>
+          <w:numId w:val="15"/>
+        </w:numPr>
         <w:spacing w:after="40"/>
       </w:pPr>
       <w:r>
@@ -1827,6 +1859,10 @@
     <w:p>
       <w:pPr>
         <w:pStyle w:val="ListNumber"/>
+        <w:numPr>
+          <w:ilvl w:val="0"/>
+          <w:numId w:val="15"/>
+        </w:numPr>
         <w:spacing w:after="40"/>
       </w:pPr>
       <w:r>
@@ -1839,6 +1875,10 @@
     <w:p>
       <w:pPr>
         <w:pStyle w:val="ListNumber"/>
+        <w:numPr>
+          <w:ilvl w:val="0"/>
+          <w:numId w:val="15"/>
+        </w:numPr>
         <w:spacing w:after="40"/>
       </w:pPr>
       <w:r>
@@ -1851,6 +1891,10 @@
     <w:p>
       <w:pPr>
         <w:pStyle w:val="ListNumber"/>
+        <w:numPr>
+          <w:ilvl w:val="0"/>
+          <w:numId w:val="15"/>
+        </w:numPr>
         <w:spacing w:after="40"/>
       </w:pPr>
       <w:r>
@@ -2225,7 +2269,7 @@
       <w:tr>
         <w:tc>
           <w:tcPr>
-            <w:tcW w:type="dxa" w:w="1981"/>
+            <w:tcW w:type="dxa" w:w="2896"/>
             <w:shd w:val="clear" w:color="auto" w:fill="EDE9FE"/>
           </w:tcPr>
           <w:p>
@@ -2246,7 +2290,7 @@
         </w:tc>
         <w:tc>
           <w:tcPr>
-            <w:tcW w:type="dxa" w:w="7430"/>
+            <w:tcW w:type="dxa" w:w="6515"/>
             <w:shd w:val="clear" w:color="auto" w:fill="EDE9FE"/>
           </w:tcPr>
           <w:p>
@@ -2269,7 +2313,7 @@
       <w:tr>
         <w:tc>
           <w:tcPr>
-            <w:tcW w:type="dxa" w:w="1981"/>
+            <w:tcW w:type="dxa" w:w="2896"/>
           </w:tcPr>
           <w:p>
             <w:pPr>
@@ -2287,7 +2331,7 @@
         </w:tc>
         <w:tc>
           <w:tcPr>
-            <w:tcW w:type="dxa" w:w="7430"/>
+            <w:tcW w:type="dxa" w:w="6515"/>
           </w:tcPr>
           <w:p>
             <w:pPr>
@@ -2307,7 +2351,7 @@
       <w:tr>
         <w:tc>
           <w:tcPr>
-            <w:tcW w:type="dxa" w:w="1981"/>
+            <w:tcW w:type="dxa" w:w="2896"/>
           </w:tcPr>
           <w:p>
             <w:pPr>
@@ -2325,7 +2369,7 @@
         </w:tc>
         <w:tc>
           <w:tcPr>
-            <w:tcW w:type="dxa" w:w="7430"/>
+            <w:tcW w:type="dxa" w:w="6515"/>
           </w:tcPr>
           <w:p>
             <w:pPr>
@@ -2345,7 +2389,7 @@
       <w:tr>
         <w:tc>
           <w:tcPr>
-            <w:tcW w:type="dxa" w:w="1981"/>
+            <w:tcW w:type="dxa" w:w="2896"/>
           </w:tcPr>
           <w:p>
             <w:pPr>
@@ -2363,7 +2407,7 @@
         </w:tc>
         <w:tc>
           <w:tcPr>
-            <w:tcW w:type="dxa" w:w="7430"/>
+            <w:tcW w:type="dxa" w:w="6515"/>
           </w:tcPr>
           <w:p>
             <w:pPr>
@@ -2383,7 +2427,7 @@
       <w:tr>
         <w:tc>
           <w:tcPr>
-            <w:tcW w:type="dxa" w:w="1981"/>
+            <w:tcW w:type="dxa" w:w="2896"/>
           </w:tcPr>
           <w:p>
             <w:pPr>
@@ -2401,7 +2445,7 @@
         </w:tc>
         <w:tc>
           <w:tcPr>
-            <w:tcW w:type="dxa" w:w="7430"/>
+            <w:tcW w:type="dxa" w:w="6515"/>
           </w:tcPr>
           <w:p>
             <w:pPr>
@@ -2421,7 +2465,7 @@
       <w:tr>
         <w:tc>
           <w:tcPr>
-            <w:tcW w:type="dxa" w:w="1981"/>
+            <w:tcW w:type="dxa" w:w="2896"/>
           </w:tcPr>
           <w:p>
             <w:pPr>
@@ -2439,7 +2483,7 @@
         </w:tc>
         <w:tc>
           <w:tcPr>
-            <w:tcW w:type="dxa" w:w="7430"/>
+            <w:tcW w:type="dxa" w:w="6515"/>
           </w:tcPr>
           <w:p>
             <w:pPr>
@@ -2671,6 +2715,42 @@
   </w:num>
   <w:num w:numId="9">
     <w:abstractNumId w:val="0"/>
+  </w:num>
+  <w:num w:numId="10">
+    <w:abstractNumId w:val="7"/>
+    <w:lvlOverride w:ilvl="0">
+      <w:startOverride w:val="1"/>
+    </w:lvlOverride>
+  </w:num>
+  <w:num w:numId="11">
+    <w:abstractNumId w:val="7"/>
+    <w:lvlOverride w:ilvl="0">
+      <w:startOverride w:val="1"/>
+    </w:lvlOverride>
+  </w:num>
+  <w:num w:numId="12">
+    <w:abstractNumId w:val="7"/>
+    <w:lvlOverride w:ilvl="0">
+      <w:startOverride w:val="1"/>
+    </w:lvlOverride>
+  </w:num>
+  <w:num w:numId="13">
+    <w:abstractNumId w:val="7"/>
+    <w:lvlOverride w:ilvl="0">
+      <w:startOverride w:val="1"/>
+    </w:lvlOverride>
+  </w:num>
+  <w:num w:numId="14">
+    <w:abstractNumId w:val="7"/>
+    <w:lvlOverride w:ilvl="0">
+      <w:startOverride w:val="1"/>
+    </w:lvlOverride>
+  </w:num>
+  <w:num w:numId="15">
+    <w:abstractNumId w:val="7"/>
+    <w:lvlOverride w:ilvl="0">
+      <w:startOverride w:val="1"/>
+    </w:lvlOverride>
   </w:num>
 </w:numbering>
 </file>

</xml_diff>

<commit_message>
Proposal and design doc: official cover/front matter (คำนำ, บทคัดย่อ, สารบัญ), plan-only proposal figures, real top-down levels 0-3 in the design doc
</commit_message>
<xml_diff>
--- a/submission/2.1_Proposal/Proposal.docx
+++ b/submission/2.1_Proposal/Proposal.docx
@@ -4,108 +4,117 @@
   <w:body>
     <w:p>
       <w:pPr>
-        <w:pStyle w:val="Heading1"/>
+        <w:spacing w:before="1200" w:after="200"/>
         <w:jc w:val="center"/>
       </w:pPr>
       <w:r>
         <w:rPr>
           <w:rFonts w:ascii="Sarabun" w:hAnsi="Sarabun" w:cs="Sarabun" w:eastAsia="Sarabun"/>
+          <w:b/>
+          <w:color w:val="000000"/>
+          <w:sz w:val="40"/>
+          <w:szCs w:val="40"/>
+          <w:bCs/>
         </w:rPr>
-        <w:t>Proposal: Tetris Duel CHAOS Edition</w:t>
+        <w:t>รายงานเสนอโครงงาน (Proposal)</w:t>
       </w:r>
     </w:p>
     <w:p>
+      <w:pPr>
+        <w:spacing w:before="0" w:after="80"/>
+        <w:jc w:val="center"/>
+      </w:pPr>
       <w:r>
         <w:rPr>
           <w:rFonts w:ascii="Sarabun" w:hAnsi="Sarabun" w:cs="Sarabun" w:eastAsia="Sarabun"/>
           <w:b/>
+          <w:color w:val="000000"/>
+          <w:sz w:val="52"/>
+          <w:szCs w:val="52"/>
           <w:bCs/>
         </w:rPr>
-        <w:t>เกมเตตริสต่อสู้สองผู้เล่นบนบอร์ด FPGA สองบอร์ด พร้อมภารกิจป่วนและวิดีโอจากหน่วยความจำแฟลช</w:t>
+        <w:t>Tetris Duel: CHAOS Edition</w:t>
       </w:r>
     </w:p>
     <w:p>
+      <w:pPr>
+        <w:spacing w:before="0" w:after="0"/>
+        <w:jc w:val="center"/>
+      </w:pPr>
       <w:r>
         <w:rPr>
           <w:rFonts w:ascii="Sarabun" w:hAnsi="Sarabun" w:cs="Sarabun" w:eastAsia="Sarabun"/>
+          <w:b w:val="0"/>
+          <w:color w:val="000000"/>
+          <w:sz w:val="32"/>
+          <w:szCs w:val="32"/>
         </w:rPr>
-        <w:t>รายวิชา 01076113 Digital System Fundamentals ปีการศึกษา 2569 ภาควิชาวิศวกรรมคอมพิวเตอร์ คณะวิศวกรรมศาสตร์ สถาบันเทคโนโลยีพระจอมเกล้าเจ้าคุณทหารลาดกระบัง</w:t>
+        <w:t>เกมเตตริสต่อสู้สองผู้เล่นบนบอร์ด FPGA</w:t>
+      </w:r>
+    </w:p>
+    <w:p>
+      <w:pPr>
+        <w:spacing w:before="1400" w:after="120"/>
+        <w:jc w:val="center"/>
+      </w:pPr>
+      <w:r>
+        <w:rPr>
+          <w:rFonts w:ascii="Sarabun" w:hAnsi="Sarabun" w:cs="Sarabun" w:eastAsia="Sarabun"/>
+          <w:b/>
+          <w:color w:val="000000"/>
+          <w:sz w:val="28"/>
+          <w:szCs w:val="28"/>
+          <w:bCs/>
+        </w:rPr>
+        <w:t>จัดทำโดย</w:t>
       </w:r>
     </w:p>
     <w:tbl>
       <w:tblPr>
-        <w:tblStyle w:val="TableGrid"/>
         <w:tblW w:type="auto" w:w="0"/>
         <w:jc w:val="center"/>
-        <w:tblLayout w:type="fixed"/>
         <w:tblLook w:firstColumn="1" w:firstRow="1" w:lastColumn="0" w:lastRow="0" w:noHBand="0" w:noVBand="1" w:val="04A0"/>
       </w:tblPr>
       <w:tblGrid>
-        <w:gridCol w:w="3137"/>
-        <w:gridCol w:w="3137"/>
-        <w:gridCol w:w="3137"/>
+        <w:gridCol w:w="4706"/>
+        <w:gridCol w:w="4706"/>
       </w:tblGrid>
       <w:tr>
         <w:tc>
           <w:tcPr>
-            <w:tcW w:type="dxa" w:w="2614"/>
-            <w:shd w:val="clear" w:color="auto" w:fill="EDE9FE"/>
+            <w:tcW w:type="dxa" w:w="3515"/>
           </w:tcPr>
           <w:p>
             <w:pPr>
-              <w:spacing w:after="0"/>
+              <w:spacing w:after="20"/>
             </w:pPr>
             <w:r>
               <w:rPr>
                 <w:rFonts w:ascii="Sarabun" w:hAnsi="Sarabun" w:cs="Sarabun" w:eastAsia="Sarabun"/>
-                <w:b/>
-                <w:sz w:val="20"/>
-                <w:szCs w:val="20"/>
-                <w:bCs/>
+                <w:color w:val="000000"/>
+                <w:sz w:val="26"/>
+                <w:szCs w:val="26"/>
               </w:rPr>
-              <w:t>ลำดับ</w:t>
+              <w:t>ธีรนัย ธรรมเพชร</w:t>
             </w:r>
           </w:p>
         </w:tc>
         <w:tc>
           <w:tcPr>
-            <w:tcW w:type="dxa" w:w="4183"/>
-            <w:shd w:val="clear" w:color="auto" w:fill="EDE9FE"/>
+            <w:tcW w:type="dxa" w:w="2494"/>
           </w:tcPr>
           <w:p>
             <w:pPr>
-              <w:spacing w:after="0"/>
+              <w:spacing w:after="20"/>
             </w:pPr>
             <w:r>
               <w:rPr>
                 <w:rFonts w:ascii="Sarabun" w:hAnsi="Sarabun" w:cs="Sarabun" w:eastAsia="Sarabun"/>
-                <w:b/>
-                <w:sz w:val="20"/>
-                <w:szCs w:val="20"/>
-                <w:bCs/>
+                <w:color w:val="000000"/>
+                <w:sz w:val="26"/>
+                <w:szCs w:val="26"/>
               </w:rPr>
-              <w:t>ชื่อ-นามสกุล</w:t>
-            </w:r>
-          </w:p>
-        </w:tc>
-        <w:tc>
-          <w:tcPr>
-            <w:tcW w:type="dxa" w:w="2614"/>
-            <w:shd w:val="clear" w:color="auto" w:fill="EDE9FE"/>
-          </w:tcPr>
-          <w:p>
-            <w:pPr>
-              <w:spacing w:after="0"/>
-            </w:pPr>
-            <w:r>
-              <w:rPr>
-                <w:rFonts w:ascii="Sarabun" w:hAnsi="Sarabun" w:cs="Sarabun" w:eastAsia="Sarabun"/>
-                <w:b/>
-                <w:sz w:val="20"/>
-                <w:szCs w:val="20"/>
-                <w:bCs/>
-              </w:rPr>
-              <w:t>รหัสนักศึกษา</w:t>
+              <w:t>รหัสนักศึกษา 68010542</w:t>
             </w:r>
           </w:p>
         </w:tc>
@@ -113,55 +122,39 @@
       <w:tr>
         <w:tc>
           <w:tcPr>
-            <w:tcW w:type="dxa" w:w="2614"/>
+            <w:tcW w:type="dxa" w:w="3515"/>
           </w:tcPr>
           <w:p>
             <w:pPr>
-              <w:spacing w:after="0"/>
+              <w:spacing w:after="20"/>
             </w:pPr>
             <w:r>
               <w:rPr>
                 <w:rFonts w:ascii="Sarabun" w:hAnsi="Sarabun" w:cs="Sarabun" w:eastAsia="Sarabun"/>
-                <w:sz w:val="20"/>
-                <w:szCs w:val="20"/>
+                <w:color w:val="000000"/>
+                <w:sz w:val="26"/>
+                <w:szCs w:val="26"/>
               </w:rPr>
-              <w:t>1</w:t>
+              <w:t>นนธพัชร์ น้อยสวัสดิ์</w:t>
             </w:r>
           </w:p>
         </w:tc>
         <w:tc>
           <w:tcPr>
-            <w:tcW w:type="dxa" w:w="4183"/>
+            <w:tcW w:type="dxa" w:w="2494"/>
           </w:tcPr>
           <w:p>
             <w:pPr>
-              <w:spacing w:after="0"/>
+              <w:spacing w:after="20"/>
             </w:pPr>
             <w:r>
               <w:rPr>
                 <w:rFonts w:ascii="Sarabun" w:hAnsi="Sarabun" w:cs="Sarabun" w:eastAsia="Sarabun"/>
-                <w:sz w:val="20"/>
-                <w:szCs w:val="20"/>
+                <w:color w:val="000000"/>
+                <w:sz w:val="26"/>
+                <w:szCs w:val="26"/>
               </w:rPr>
-              <w:t>ธีรนัย ธรรมเพชร</w:t>
-            </w:r>
-          </w:p>
-        </w:tc>
-        <w:tc>
-          <w:tcPr>
-            <w:tcW w:type="dxa" w:w="2614"/>
-          </w:tcPr>
-          <w:p>
-            <w:pPr>
-              <w:spacing w:after="0"/>
-            </w:pPr>
-            <w:r>
-              <w:rPr>
-                <w:rFonts w:ascii="Sarabun" w:hAnsi="Sarabun" w:cs="Sarabun" w:eastAsia="Sarabun"/>
-                <w:sz w:val="20"/>
-                <w:szCs w:val="20"/>
-              </w:rPr>
-              <w:t>68010542</w:t>
+              <w:t>รหัสนักศึกษา 68010558</w:t>
             </w:r>
           </w:p>
         </w:tc>
@@ -169,55 +162,39 @@
       <w:tr>
         <w:tc>
           <w:tcPr>
-            <w:tcW w:type="dxa" w:w="2614"/>
+            <w:tcW w:type="dxa" w:w="3515"/>
           </w:tcPr>
           <w:p>
             <w:pPr>
-              <w:spacing w:after="0"/>
+              <w:spacing w:after="20"/>
             </w:pPr>
             <w:r>
               <w:rPr>
                 <w:rFonts w:ascii="Sarabun" w:hAnsi="Sarabun" w:cs="Sarabun" w:eastAsia="Sarabun"/>
-                <w:sz w:val="20"/>
-                <w:szCs w:val="20"/>
+                <w:color w:val="000000"/>
+                <w:sz w:val="26"/>
+                <w:szCs w:val="26"/>
               </w:rPr>
-              <w:t>2</w:t>
+              <w:t>พิสิษฐ์ ปัญคิวจณาณ์</w:t>
             </w:r>
           </w:p>
         </w:tc>
         <w:tc>
           <w:tcPr>
-            <w:tcW w:type="dxa" w:w="4183"/>
+            <w:tcW w:type="dxa" w:w="2494"/>
           </w:tcPr>
           <w:p>
             <w:pPr>
-              <w:spacing w:after="0"/>
+              <w:spacing w:after="20"/>
             </w:pPr>
             <w:r>
               <w:rPr>
                 <w:rFonts w:ascii="Sarabun" w:hAnsi="Sarabun" w:cs="Sarabun" w:eastAsia="Sarabun"/>
-                <w:sz w:val="20"/>
-                <w:szCs w:val="20"/>
+                <w:color w:val="000000"/>
+                <w:sz w:val="26"/>
+                <w:szCs w:val="26"/>
               </w:rPr>
-              <w:t>นนธพัชร์ น้อยสวัสดิ์</w:t>
-            </w:r>
-          </w:p>
-        </w:tc>
-        <w:tc>
-          <w:tcPr>
-            <w:tcW w:type="dxa" w:w="2614"/>
-          </w:tcPr>
-          <w:p>
-            <w:pPr>
-              <w:spacing w:after="0"/>
-            </w:pPr>
-            <w:r>
-              <w:rPr>
-                <w:rFonts w:ascii="Sarabun" w:hAnsi="Sarabun" w:cs="Sarabun" w:eastAsia="Sarabun"/>
-                <w:sz w:val="20"/>
-                <w:szCs w:val="20"/>
-              </w:rPr>
-              <w:t>68010558</w:t>
+              <w:t>รหัสนักศึกษา 68010798</w:t>
             </w:r>
           </w:p>
         </w:tc>
@@ -225,55 +202,39 @@
       <w:tr>
         <w:tc>
           <w:tcPr>
-            <w:tcW w:type="dxa" w:w="2614"/>
+            <w:tcW w:type="dxa" w:w="3515"/>
           </w:tcPr>
           <w:p>
             <w:pPr>
-              <w:spacing w:after="0"/>
+              <w:spacing w:after="20"/>
             </w:pPr>
             <w:r>
               <w:rPr>
                 <w:rFonts w:ascii="Sarabun" w:hAnsi="Sarabun" w:cs="Sarabun" w:eastAsia="Sarabun"/>
-                <w:sz w:val="20"/>
-                <w:szCs w:val="20"/>
+                <w:color w:val="000000"/>
+                <w:sz w:val="26"/>
+                <w:szCs w:val="26"/>
               </w:rPr>
-              <w:t>3</w:t>
+              <w:t>อนาคม อเล็กซองดรู สุวรรณวร</w:t>
             </w:r>
           </w:p>
         </w:tc>
         <w:tc>
           <w:tcPr>
-            <w:tcW w:type="dxa" w:w="4183"/>
+            <w:tcW w:type="dxa" w:w="2494"/>
           </w:tcPr>
           <w:p>
             <w:pPr>
-              <w:spacing w:after="0"/>
+              <w:spacing w:after="20"/>
             </w:pPr>
             <w:r>
               <w:rPr>
                 <w:rFonts w:ascii="Sarabun" w:hAnsi="Sarabun" w:cs="Sarabun" w:eastAsia="Sarabun"/>
-                <w:sz w:val="20"/>
-                <w:szCs w:val="20"/>
+                <w:color w:val="000000"/>
+                <w:sz w:val="26"/>
+                <w:szCs w:val="26"/>
               </w:rPr>
-              <w:t>พิสิษฐ์ ปัญคิวจณาณ์</w:t>
-            </w:r>
-          </w:p>
-        </w:tc>
-        <w:tc>
-          <w:tcPr>
-            <w:tcW w:type="dxa" w:w="2614"/>
-          </w:tcPr>
-          <w:p>
-            <w:pPr>
-              <w:spacing w:after="0"/>
-            </w:pPr>
-            <w:r>
-              <w:rPr>
-                <w:rFonts w:ascii="Sarabun" w:hAnsi="Sarabun" w:cs="Sarabun" w:eastAsia="Sarabun"/>
-                <w:sz w:val="20"/>
-                <w:szCs w:val="20"/>
-              </w:rPr>
-              <w:t>68010798</w:t>
+              <w:t>รหัสนักศึกษา 68011217</w:t>
             </w:r>
           </w:p>
         </w:tc>
@@ -281,91 +242,18 @@
       <w:tr>
         <w:tc>
           <w:tcPr>
-            <w:tcW w:type="dxa" w:w="2614"/>
+            <w:tcW w:type="dxa" w:w="3515"/>
           </w:tcPr>
           <w:p>
             <w:pPr>
-              <w:spacing w:after="0"/>
+              <w:spacing w:after="20"/>
             </w:pPr>
             <w:r>
               <w:rPr>
                 <w:rFonts w:ascii="Sarabun" w:hAnsi="Sarabun" w:cs="Sarabun" w:eastAsia="Sarabun"/>
-                <w:sz w:val="20"/>
-                <w:szCs w:val="20"/>
-              </w:rPr>
-              <w:t>4</w:t>
-            </w:r>
-          </w:p>
-        </w:tc>
-        <w:tc>
-          <w:tcPr>
-            <w:tcW w:type="dxa" w:w="4183"/>
-          </w:tcPr>
-          <w:p>
-            <w:pPr>
-              <w:spacing w:after="0"/>
-            </w:pPr>
-            <w:r>
-              <w:rPr>
-                <w:rFonts w:ascii="Sarabun" w:hAnsi="Sarabun" w:cs="Sarabun" w:eastAsia="Sarabun"/>
-                <w:sz w:val="20"/>
-                <w:szCs w:val="20"/>
-              </w:rPr>
-              <w:t>อนาคม อเล็กซองดรู สุวรรณวร</w:t>
-            </w:r>
-          </w:p>
-        </w:tc>
-        <w:tc>
-          <w:tcPr>
-            <w:tcW w:type="dxa" w:w="2614"/>
-          </w:tcPr>
-          <w:p>
-            <w:pPr>
-              <w:spacing w:after="0"/>
-            </w:pPr>
-            <w:r>
-              <w:rPr>
-                <w:rFonts w:ascii="Sarabun" w:hAnsi="Sarabun" w:cs="Sarabun" w:eastAsia="Sarabun"/>
-                <w:sz w:val="20"/>
-                <w:szCs w:val="20"/>
-              </w:rPr>
-              <w:t>68011217</w:t>
-            </w:r>
-          </w:p>
-        </w:tc>
-      </w:tr>
-      <w:tr>
-        <w:tc>
-          <w:tcPr>
-            <w:tcW w:type="dxa" w:w="2614"/>
-          </w:tcPr>
-          <w:p>
-            <w:pPr>
-              <w:spacing w:after="0"/>
-            </w:pPr>
-            <w:r>
-              <w:rPr>
-                <w:rFonts w:ascii="Sarabun" w:hAnsi="Sarabun" w:cs="Sarabun" w:eastAsia="Sarabun"/>
-                <w:sz w:val="20"/>
-                <w:szCs w:val="20"/>
-              </w:rPr>
-              <w:t>5</w:t>
-            </w:r>
-          </w:p>
-        </w:tc>
-        <w:tc>
-          <w:tcPr>
-            <w:tcW w:type="dxa" w:w="4183"/>
-          </w:tcPr>
-          <w:p>
-            <w:pPr>
-              <w:spacing w:after="0"/>
-            </w:pPr>
-            <w:r>
-              <w:rPr>
-                <w:rFonts w:ascii="Sarabun" w:hAnsi="Sarabun" w:cs="Sarabun" w:eastAsia="Sarabun"/>
-                <w:sz w:val="20"/>
-                <w:szCs w:val="20"/>
+                <w:color w:val="000000"/>
+                <w:sz w:val="26"/>
+                <w:szCs w:val="26"/>
               </w:rPr>
               <w:t>ชนกภูมิ สันติอัศวราภรณ์</w:t>
             </w:r>
@@ -373,19 +261,20 @@
         </w:tc>
         <w:tc>
           <w:tcPr>
-            <w:tcW w:type="dxa" w:w="2614"/>
+            <w:tcW w:type="dxa" w:w="2494"/>
           </w:tcPr>
           <w:p>
             <w:pPr>
-              <w:spacing w:after="0"/>
+              <w:spacing w:after="20"/>
             </w:pPr>
             <w:r>
               <w:rPr>
                 <w:rFonts w:ascii="Sarabun" w:hAnsi="Sarabun" w:cs="Sarabun" w:eastAsia="Sarabun"/>
-                <w:sz w:val="20"/>
-                <w:szCs w:val="20"/>
+                <w:color w:val="000000"/>
+                <w:sz w:val="26"/>
+                <w:szCs w:val="26"/>
               </w:rPr>
-              <w:t>68011641</w:t>
+              <w:t>รหัสนักศึกษา 68011641</w:t>
             </w:r>
           </w:p>
         </w:tc>
@@ -393,8 +282,105 @@
     </w:tbl>
     <w:p>
       <w:pPr>
-        <w:spacing w:after="40"/>
+        <w:spacing w:before="800" w:after="80"/>
+        <w:jc w:val="center"/>
       </w:pPr>
+      <w:r>
+        <w:rPr>
+          <w:rFonts w:ascii="Sarabun" w:hAnsi="Sarabun" w:cs="Sarabun" w:eastAsia="Sarabun"/>
+          <w:b/>
+          <w:color w:val="000000"/>
+          <w:sz w:val="28"/>
+          <w:szCs w:val="28"/>
+          <w:bCs/>
+        </w:rPr>
+        <w:t>เสนอ</w:t>
+      </w:r>
+    </w:p>
+    <w:p>
+      <w:pPr>
+        <w:spacing w:before="0" w:after="40"/>
+        <w:jc w:val="center"/>
+      </w:pPr>
+      <w:r>
+        <w:rPr>
+          <w:rFonts w:ascii="Sarabun" w:hAnsi="Sarabun" w:cs="Sarabun" w:eastAsia="Sarabun"/>
+          <w:b w:val="0"/>
+          <w:color w:val="000000"/>
+          <w:sz w:val="26"/>
+          <w:szCs w:val="26"/>
+        </w:rPr>
+        <w:t>รศ. ดร. เจริญ วงษ์ชุ่มเย็น</w:t>
+      </w:r>
+    </w:p>
+    <w:p>
+      <w:pPr>
+        <w:spacing w:before="2600" w:after="0"/>
+        <w:jc w:val="center"/>
+      </w:pPr>
+      <w:r>
+        <w:rPr>
+          <w:rFonts w:ascii="Sarabun" w:hAnsi="Sarabun" w:cs="Sarabun" w:eastAsia="Sarabun"/>
+          <w:b w:val="0"/>
+          <w:color w:val="000000"/>
+          <w:sz w:val="26"/>
+          <w:szCs w:val="26"/>
+        </w:rPr>
+        <w:t>รายงานนี้เป็นส่วนหนึ่งของรายวิชา 01076113 Digital System Fundamentals</w:t>
+      </w:r>
+    </w:p>
+    <w:p>
+      <w:pPr>
+        <w:spacing w:before="0" w:after="0"/>
+        <w:jc w:val="center"/>
+      </w:pPr>
+      <w:r>
+        <w:rPr>
+          <w:rFonts w:ascii="Sarabun" w:hAnsi="Sarabun" w:cs="Sarabun" w:eastAsia="Sarabun"/>
+          <w:b w:val="0"/>
+          <w:color w:val="000000"/>
+          <w:sz w:val="26"/>
+          <w:szCs w:val="26"/>
+        </w:rPr>
+        <w:t>ภาคเรียนที่ 1 ปีการศึกษา 2569</w:t>
+      </w:r>
+    </w:p>
+    <w:p>
+      <w:pPr>
+        <w:spacing w:before="0" w:after="0"/>
+        <w:jc w:val="center"/>
+      </w:pPr>
+      <w:r>
+        <w:rPr>
+          <w:rFonts w:ascii="Sarabun" w:hAnsi="Sarabun" w:cs="Sarabun" w:eastAsia="Sarabun"/>
+          <w:b w:val="0"/>
+          <w:color w:val="000000"/>
+          <w:sz w:val="26"/>
+          <w:szCs w:val="26"/>
+        </w:rPr>
+        <w:t>ภาควิชาวิศวกรรมคอมพิวเตอร์ คณะวิศวกรรมศาสตร์</w:t>
+      </w:r>
+    </w:p>
+    <w:p>
+      <w:pPr>
+        <w:spacing w:before="0" w:after="0"/>
+        <w:jc w:val="center"/>
+      </w:pPr>
+      <w:r>
+        <w:rPr>
+          <w:rFonts w:ascii="Sarabun" w:hAnsi="Sarabun" w:cs="Sarabun" w:eastAsia="Sarabun"/>
+          <w:b w:val="0"/>
+          <w:color w:val="000000"/>
+          <w:sz w:val="26"/>
+          <w:szCs w:val="26"/>
+        </w:rPr>
+        <w:t>สถาบันเทคโนโลยีพระจอมเกล้าเจ้าคุณทหารลาดกระบัง</w:t>
+      </w:r>
+    </w:p>
+    <w:p>
+      <w:r>
+        <w:br w:type="page"/>
+      </w:r>
     </w:p>
     <w:p>
       <w:pPr>
@@ -408,6 +394,9 @@
       </w:r>
     </w:p>
     <w:p>
+      <w:pPr>
+        <w:ind w:firstLine="567"/>
+      </w:pPr>
       <w:r>
         <w:rPr>
           <w:rFonts w:ascii="Sarabun" w:hAnsi="Sarabun" w:cs="Sarabun" w:eastAsia="Sarabun"/>
@@ -435,6 +424,9 @@
       </w:r>
     </w:p>
     <w:p>
+      <w:pPr>
+        <w:ind w:firstLine="567"/>
+      </w:pPr>
       <w:r>
         <w:rPr>
           <w:rFonts w:ascii="Sarabun" w:hAnsi="Sarabun" w:cs="Sarabun" w:eastAsia="Sarabun"/>
@@ -577,6 +569,9 @@
       </w:r>
     </w:p>
     <w:p>
+      <w:pPr>
+        <w:ind w:firstLine="567"/>
+      </w:pPr>
       <w:r>
         <w:rPr>
           <w:rFonts w:ascii="Sarabun" w:hAnsi="Sarabun" w:cs="Sarabun" w:eastAsia="Sarabun"/>
@@ -595,7 +590,7 @@
         <w:rPr>
           <w:rFonts w:ascii="Sarabun" w:hAnsi="Sarabun" w:cs="Sarabun" w:eastAsia="Sarabun"/>
         </w:rPr>
-        <w:t xml:space="preserve"> แทนอุปกรณ์ที่ใช้งานคนเดียว จึงเลือกทำเตตริสแบบ "ดวล" ที่ผู้เล่นสองคนใช้บอร์ดคนละบอร์ด ส่งแถวขยะ (garbage) ใส่กันได้ผ่านสายเชื่อม แล้วเพิ่มความแปลกใหม่ด้วยโหมด </w:t>
+        <w:t xml:space="preserve"> แทนอุปกรณ์ที่ใช้งานคนเดียว จึงเลือกทำเตตริสแบบ "ดวล" ที่ผู้เล่นสองคนใช้บอร์ดคนละบอร์ด ส่งแถวขยะ (garbage) ใส่กันได้ผ่านสายเชื่อม แล้วเพิ่มความแปลกใหม่ด้วย </w:t>
       </w:r>
       <w:r>
         <w:rPr>
@@ -603,7 +598,7 @@
           <w:b/>
           <w:bCs/>
         </w:rPr>
-        <w:t>CHAOS</w:t>
+        <w:t>โหมด CHAOS</w:t>
       </w:r>
       <w:r>
         <w:rPr>
@@ -636,21 +631,7 @@
         <w:rPr>
           <w:rFonts w:ascii="Sarabun" w:hAnsi="Sarabun" w:cs="Sarabun" w:eastAsia="Sarabun"/>
         </w:rPr>
-        <w:t xml:space="preserve">เพื่อออกแบบและสร้างระบบดิจิทัลขนาดใหญ่บน FPGA ด้วยกระบวนการ </w:t>
-      </w:r>
-      <w:r>
-        <w:rPr>
-          <w:rFonts w:ascii="Sarabun" w:hAnsi="Sarabun" w:cs="Sarabun" w:eastAsia="Sarabun"/>
-          <w:b/>
-          <w:bCs/>
-        </w:rPr>
-        <w:t>Top-Down Design</w:t>
-      </w:r>
-      <w:r>
-        <w:rPr>
-          <w:rFonts w:ascii="Sarabun" w:hAnsi="Sarabun" w:cs="Sarabun" w:eastAsia="Sarabun"/>
-        </w:rPr>
-        <w:t>: แบ่งระบบเป็นโมดูลย่อยที่ออกแบบ ทดสอบ และประกอบรวมกันได้</w:t>
+        <w:t>เพื่อออกแบบและสร้างระบบดิจิทัลขนาดใหญ่บน FPGA โดยแบ่งระบบเป็นโมดูลย่อยที่ออกแบบ ทดสอบ และประกอบรวมกันได้</w:t>
       </w:r>
     </w:p>
     <w:p>
@@ -745,11 +726,11 @@
               <a:graphicData uri="http://schemas.openxmlformats.org/drawingml/2006/picture">
                 <pic:pic>
                   <pic:nvPicPr>
-                    <pic:cNvPr id="0" name="fig_system.png"/>
+                    <pic:cNvPr id="0" name="fig_system_plan.png"/>
                     <pic:cNvPicPr/>
                   </pic:nvPicPr>
                   <pic:blipFill>
-                    <a:blip r:embed="rId9"/>
+                    <a:blip r:embed="rId10"/>
                     <a:stretch>
                       <a:fillRect/>
                     </a:stretch>
@@ -775,15 +756,28 @@
       <w:r>
         <w:rPr>
           <w:rFonts w:ascii="Sarabun" w:hAnsi="Sarabun" w:cs="Sarabun" w:eastAsia="Sarabun"/>
-          <w:i/>
-          <w:color w:val="5B6475"/>
+          <w:b/>
+          <w:color w:val="000000"/>
+          <w:sz w:val="20"/>
+          <w:szCs w:val="20"/>
+          <w:bCs/>
+        </w:rPr>
+        <w:t xml:space="preserve">ภาพที่ 1 </w:t>
+      </w:r>
+      <w:r>
+        <w:rPr>
+          <w:rFonts w:ascii="Sarabun" w:hAnsi="Sarabun" w:cs="Sarabun" w:eastAsia="Sarabun"/>
+          <w:color w:val="555B66"/>
           <w:sz w:val="20"/>
           <w:szCs w:val="20"/>
         </w:rPr>
-        <w:t>ภาพรวมระบบ: บอร์ดสองบอร์ด เชื่อมด้วยสาย 3 เส้น แต่ละบอร์ดมีจอ VGA ลำโพง และชิปแฟลช</w:t>
+        <w:t>ภาพรวมระบบที่วางแผนไว้: บอร์ดสองบอร์ด เชื่อมด้วยสาย 3 เส้น แต่ละบอร์ดมีจอ VGA หูฟังหรือลำโพง และชิปแฟลช</w:t>
       </w:r>
     </w:p>
     <w:p>
+      <w:pPr>
+        <w:ind w:firstLine="567"/>
+      </w:pPr>
       <w:r>
         <w:rPr>
           <w:rFonts w:ascii="Sarabun" w:hAnsi="Sarabun" w:cs="Sarabun" w:eastAsia="Sarabun"/>
@@ -804,16 +798,8 @@
     </w:p>
     <w:p>
       <w:pPr>
-        <w:pStyle w:val="Heading3"/>
+        <w:ind w:firstLine="567"/>
       </w:pPr>
-      <w:r>
-        <w:rPr>
-          <w:rFonts w:ascii="Sarabun" w:hAnsi="Sarabun" w:cs="Sarabun" w:eastAsia="Sarabun"/>
-        </w:rPr>
-        <w:t>5.1 สิ่งที่ชิ้นงานทำได้ (ในขอบเขต)</w:t>
-      </w:r>
-    </w:p>
-    <w:p>
       <w:r>
         <w:rPr>
           <w:rFonts w:ascii="Sarabun" w:hAnsi="Sarabun" w:cs="Sarabun" w:eastAsia="Sarabun"/>
@@ -904,6 +890,9 @@
       </w:r>
     </w:p>
     <w:p>
+      <w:pPr>
+        <w:ind w:firstLine="567"/>
+      </w:pPr>
       <w:r>
         <w:rPr>
           <w:rFonts w:ascii="Sarabun" w:hAnsi="Sarabun" w:cs="Sarabun" w:eastAsia="Sarabun"/>
@@ -926,7 +915,7 @@
         <w:rPr>
           <w:rFonts w:ascii="Sarabun" w:hAnsi="Sarabun" w:cs="Sarabun" w:eastAsia="Sarabun"/>
         </w:rPr>
-        <w:t>สื่อสารผ่าน UART 115,200 bps บนสาย 3 เส้น โดยใช้ข้อความขนาด 1 ไบต์ 5 ชนิด</w:t>
+        <w:t>สื่อสารผ่าน UART บนสาย 3 เส้น โดยส่งข้อความสั้นขนาด 1 ไบต์ (เช่น เริ่มเกม, ส่งขยะ, แพ้, ความสูงกอง)</w:t>
       </w:r>
     </w:p>
     <w:p>
@@ -942,7 +931,7 @@
         <w:rPr>
           <w:rFonts w:ascii="Sarabun" w:hAnsi="Sarabun" w:cs="Sarabun" w:eastAsia="Sarabun"/>
         </w:rPr>
-        <w:t>ล้าง 2 / 3 / 4 แถวพร้อมกัน → ส่งแถวขยะ 1 / 2 / 4 แถวให้คู่แข่ง (หักล้างกับขยะที่รอเข้ามาได้)</w:t>
+        <w:t>ล้าง 2 / 3 / 4 แถวพร้อมกัน → ส่งแถวขยะ 1 / 2 / 4 แถวให้คู่แข่ง (หักล้างกับแถวขยะที่กำลังจะเข้ามาหาเราก่อน)</w:t>
       </w:r>
     </w:p>
     <w:p>
@@ -994,6 +983,9 @@
       </w:r>
     </w:p>
     <w:p>
+      <w:pPr>
+        <w:ind w:firstLine="567"/>
+      </w:pPr>
       <w:r>
         <w:rPr>
           <w:rFonts w:ascii="Sarabun" w:hAnsi="Sarabun" w:cs="Sarabun" w:eastAsia="Sarabun"/>
@@ -1016,7 +1008,7 @@
         <w:rPr>
           <w:rFonts w:ascii="Sarabun" w:hAnsi="Sarabun" w:cs="Sarabun" w:eastAsia="Sarabun"/>
         </w:rPr>
-        <w:t>ภารกิจสุ่มทุก 10-17 วินาที 7 แบบ ทำด้วยสวิตช์เลื่อน 8 ตัว ภายในเวลาจำกัด (โยกสวิตช์ 10 ครั้ง, ทำตามรูปแบบไฟ, ตั้งเลขฐานสอง, ตั้งเลขฐานสิบหก, ห้ามแตะปุ่ม, คุมแถบให้อยู่ในโซน, โยกให้ตรงจังหวะ)</w:t>
+        <w:t>ภารกิจหลายแบบ สุ่มขึ้นมาเป็นระยะระหว่างเล่น ทำด้วยสวิตช์เลื่อน 8 ตัว ภายในเวลาจำกัด</w:t>
       </w:r>
     </w:p>
     <w:p>
@@ -1032,7 +1024,7 @@
         <w:rPr>
           <w:rFonts w:ascii="Sarabun" w:hAnsi="Sarabun" w:cs="Sarabun" w:eastAsia="Sarabun"/>
         </w:rPr>
-        <w:t xml:space="preserve">ทำภารกิจสำเร็จ → สุ่ม: โอกาส 62.5 % (5 ใน 8) ได้ </w:t>
+        <w:t xml:space="preserve">ทำภารกิจสำเร็จ → สุ่มได้ </w:t>
       </w:r>
       <w:r>
         <w:rPr>
@@ -1046,7 +1038,7 @@
         <w:rPr>
           <w:rFonts w:ascii="Sarabun" w:hAnsi="Sarabun" w:cs="Sarabun" w:eastAsia="Sarabun"/>
         </w:rPr>
-        <w:t xml:space="preserve"> คู่แข่ง (11 แบบ: MIRROR, FLIP, BLIND, BOUNCERS, +3 GARBAGE, CURSED, SPEED, LOCK และวิดีโอ 3 แบบ) และโอกาส 37.5 % (3 ใน 8) ได้ </w:t>
+        <w:t xml:space="preserve"> คู่แข่ง หรือได้ </w:t>
       </w:r>
       <w:r>
         <w:rPr>
@@ -1060,10 +1052,13 @@
         <w:rPr>
           <w:rFonts w:ascii="Sarabun" w:hAnsi="Sarabun" w:cs="Sarabun" w:eastAsia="Sarabun"/>
         </w:rPr>
-        <w:t xml:space="preserve"> ให้ตัวเอง (3 แบบ: FREEZE, SINK, I-PIECE; ถ้าไม่ได้ต่อบอร์ดจะได้โบนัสเสมอ)</w:t>
+        <w:t xml:space="preserve"> ให้ตัวเอง</w:t>
       </w:r>
     </w:p>
     <w:p>
+      <w:pPr>
+        <w:ind w:firstLine="567"/>
+      </w:pPr>
       <w:r>
         <w:rPr>
           <w:rFonts w:ascii="Sarabun" w:hAnsi="Sarabun" w:cs="Sarabun" w:eastAsia="Sarabun"/>
@@ -1086,7 +1081,7 @@
         <w:rPr>
           <w:rFonts w:ascii="Sarabun" w:hAnsi="Sarabun" w:cs="Sarabun" w:eastAsia="Sarabun"/>
         </w:rPr>
-        <w:t>เพลงประกอบระหว่างเล่น (ADPCM 16 kHz), เล่นต่อจากจุดเดิมหลังโดนโจมตี</w:t>
+        <w:t>เพลงประกอบระหว่างเล่น (บีบอัดแบบ ADPCM), เล่นต่อจากจุดเดิมหลังโดนโจมตี</w:t>
       </w:r>
     </w:p>
     <w:p>
@@ -1102,7 +1097,7 @@
         <w:rPr>
           <w:rFonts w:ascii="Sarabun" w:hAnsi="Sarabun" w:cs="Sarabun" w:eastAsia="Sarabun"/>
         </w:rPr>
-        <w:t>การโจมตีแบบวิดีโอ 3 แบบ (Bad Apple!!, OIIA OIIA, Jevil) เล่นเป็นพื้นหลังของจอคู่แข่งพร้อมเสียง</w:t>
+        <w:t>การโจมตีแบบวิดีโอ (เช่น Bad Apple!!, OIIA OIIA, Jevil) เล่นเป็นพื้นหลังของจอคู่แข่งพร้อมเสียง</w:t>
       </w:r>
     </w:p>
     <w:p>
@@ -1134,116 +1129,7 @@
         <w:rPr>
           <w:rFonts w:ascii="Sarabun" w:hAnsi="Sarabun" w:cs="Sarabun" w:eastAsia="Sarabun"/>
         </w:rPr>
-        <w:t>สื่อทั้งหมดประมาณ 6.9 MB เก็บในชิปแฟลช 8 MB บนบอร์ด เขียนครั้งเดียวด้วยโปรแกรมที่กลุ่มเขียนเอง (Python)</w:t>
-      </w:r>
-    </w:p>
-    <w:p>
-      <w:pPr>
-        <w:pStyle w:val="Heading3"/>
-      </w:pPr>
-      <w:r>
-        <w:rPr>
-          <w:rFonts w:ascii="Sarabun" w:hAnsi="Sarabun" w:cs="Sarabun" w:eastAsia="Sarabun"/>
-        </w:rPr>
-        <w:t>5.2 ส่วนเสริม (นอกขอบเขตหลัก)</w:t>
-      </w:r>
-    </w:p>
-    <w:p>
-      <w:pPr>
-        <w:pStyle w:val="ListBullet"/>
-        <w:spacing w:after="40"/>
-      </w:pPr>
-      <w:r>
-        <w:rPr>
-          <w:rFonts w:ascii="Sarabun" w:hAnsi="Sarabun" w:cs="Sarabun" w:eastAsia="Sarabun"/>
-        </w:rPr>
-        <w:t>โปรแกรม PC (</w:t>
-      </w:r>
-      <w:r>
-        <w:rPr>
-          <w:rFonts w:ascii="Consolas" w:hAnsi="Consolas" w:cs="Consolas" w:eastAsia="Consolas"/>
-          <w:color w:val="9D174D"/>
-          <w:sz w:val="20"/>
-          <w:szCs w:val="20"/>
-        </w:rPr>
-        <w:t>fake_opponent.py</w:t>
-      </w:r>
-      <w:r>
-        <w:rPr>
-          <w:rFonts w:ascii="Sarabun" w:hAnsi="Sarabun" w:cs="Sarabun" w:eastAsia="Sarabun"/>
-        </w:rPr>
-        <w:t>) เล่นเป็นคู่แข่งผ่านสาย USB เมื่อมีบอร์ดเดียว</w:t>
-      </w:r>
-    </w:p>
-    <w:p>
-      <w:pPr>
-        <w:pStyle w:val="ListBullet"/>
-        <w:spacing w:after="40"/>
-      </w:pPr>
-      <w:r>
-        <w:rPr>
-          <w:rFonts w:ascii="Sarabun" w:hAnsi="Sarabun" w:cs="Sarabun" w:eastAsia="Sarabun"/>
-        </w:rPr>
-        <w:t>วงจรทดสอบฮาร์ดแวร์ 6 ชุด (VGA, หาขา J5, UART, การเชื่อมบอร์ด, ตรวจขา UART, อ่านแฟลช)</w:t>
-      </w:r>
-    </w:p>
-    <w:p>
-      <w:pPr>
-        <w:pStyle w:val="ListBullet"/>
-        <w:spacing w:after="40"/>
-      </w:pPr>
-      <w:r>
-        <w:rPr>
-          <w:rFonts w:ascii="Sarabun" w:hAnsi="Sarabun" w:cs="Sarabun" w:eastAsia="Sarabun"/>
-        </w:rPr>
-        <w:t>testbench จำลองการทำงาน 13 ชุด และเอกสารอธิบายโค้ดทุกบรรทัด</w:t>
-      </w:r>
-    </w:p>
-    <w:p>
-      <w:pPr>
-        <w:pStyle w:val="Heading3"/>
-      </w:pPr>
-      <w:r>
-        <w:rPr>
-          <w:rFonts w:ascii="Sarabun" w:hAnsi="Sarabun" w:cs="Sarabun" w:eastAsia="Sarabun"/>
-        </w:rPr>
-        <w:t>5.3 ข้อจำกัด</w:t>
-      </w:r>
-    </w:p>
-    <w:p>
-      <w:pPr>
-        <w:pStyle w:val="ListBullet"/>
-        <w:spacing w:after="40"/>
-      </w:pPr>
-      <w:r>
-        <w:rPr>
-          <w:rFonts w:ascii="Sarabun" w:hAnsi="Sarabun" w:cs="Sarabun" w:eastAsia="Sarabun"/>
-        </w:rPr>
-        <w:t>ใช้บอร์ด EDGE Spartan-7 (XC7S15) เท่านั้น ไม่มี CPU หรือไมโครคอนโทรลเลอร์ภายนอก</w:t>
-      </w:r>
-    </w:p>
-    <w:p>
-      <w:pPr>
-        <w:pStyle w:val="ListBullet"/>
-        <w:spacing w:after="40"/>
-      </w:pPr>
-      <w:r>
-        <w:rPr>
-          <w:rFonts w:ascii="Sarabun" w:hAnsi="Sarabun" w:cs="Sarabun" w:eastAsia="Sarabun"/>
-        </w:rPr>
-        <w:t>ไม่มี RAM ภายนอก: ภาพวิดีโอต้องลดเป็น 160 × 120 พิกเซล (ขยาย 4 เท่าบนจอ) และบีบอัด</w:t>
-      </w:r>
-    </w:p>
-    <w:p>
-      <w:pPr>
-        <w:pStyle w:val="ListBullet"/>
-        <w:spacing w:after="40"/>
-      </w:pPr>
-      <w:r>
-        <w:rPr>
-          <w:rFonts w:ascii="Sarabun" w:hAnsi="Sarabun" w:cs="Sarabun" w:eastAsia="Sarabun"/>
-        </w:rPr>
-        <w:t>เสียงออกช่องหูฟังโดยตรงจากขา FPGA (sigma-delta) ไม่มีวงจรขยายเสียง</w:t>
+        <w:t>สื่อทั้งหมดต้องใส่ได้ในชิปแฟลช 8 MB บนบอร์ด (ร่วมกับไฟล์วงจร) แปลงและเขียนลงแฟลชด้วยโปรแกรม Python ที่กลุ่มเขียนเอง</w:t>
       </w:r>
     </w:p>
     <w:p>
@@ -1273,8 +1159,8 @@
       <w:tr>
         <w:tc>
           <w:tcPr>
-            <w:tcW w:type="dxa" w:w="4183"/>
-            <w:shd w:val="clear" w:color="auto" w:fill="EDE9FE"/>
+            <w:tcW w:type="dxa" w:w="3929"/>
+            <w:shd w:val="clear" w:color="auto" w:fill="E5E7EB"/>
           </w:tcPr>
           <w:p>
             <w:pPr>
@@ -1294,8 +1180,8 @@
         </w:tc>
         <w:tc>
           <w:tcPr>
-            <w:tcW w:type="dxa" w:w="1743"/>
-            <w:shd w:val="clear" w:color="auto" w:fill="EDE9FE"/>
+            <w:tcW w:type="dxa" w:w="1827"/>
+            <w:shd w:val="clear" w:color="auto" w:fill="E5E7EB"/>
           </w:tcPr>
           <w:p>
             <w:pPr>
@@ -1315,8 +1201,8 @@
         </w:tc>
         <w:tc>
           <w:tcPr>
-            <w:tcW w:type="dxa" w:w="3486"/>
-            <w:shd w:val="clear" w:color="auto" w:fill="EDE9FE"/>
+            <w:tcW w:type="dxa" w:w="3655"/>
+            <w:shd w:val="clear" w:color="auto" w:fill="E5E7EB"/>
           </w:tcPr>
           <w:p>
             <w:pPr>
@@ -1338,7 +1224,7 @@
       <w:tr>
         <w:tc>
           <w:tcPr>
-            <w:tcW w:type="dxa" w:w="4183"/>
+            <w:tcW w:type="dxa" w:w="3929"/>
           </w:tcPr>
           <w:p>
             <w:pPr>
@@ -1356,7 +1242,7 @@
         </w:tc>
         <w:tc>
           <w:tcPr>
-            <w:tcW w:type="dxa" w:w="1743"/>
+            <w:tcW w:type="dxa" w:w="1827"/>
           </w:tcPr>
           <w:p>
             <w:pPr>
@@ -1374,7 +1260,7 @@
         </w:tc>
         <w:tc>
           <w:tcPr>
-            <w:tcW w:type="dxa" w:w="3486"/>
+            <w:tcW w:type="dxa" w:w="3655"/>
           </w:tcPr>
           <w:p>
             <w:pPr>
@@ -1394,7 +1280,7 @@
       <w:tr>
         <w:tc>
           <w:tcPr>
-            <w:tcW w:type="dxa" w:w="4183"/>
+            <w:tcW w:type="dxa" w:w="3929"/>
           </w:tcPr>
           <w:p>
             <w:pPr>
@@ -1412,7 +1298,7 @@
         </w:tc>
         <w:tc>
           <w:tcPr>
-            <w:tcW w:type="dxa" w:w="1743"/>
+            <w:tcW w:type="dxa" w:w="1827"/>
           </w:tcPr>
           <w:p>
             <w:pPr>
@@ -1430,7 +1316,7 @@
         </w:tc>
         <w:tc>
           <w:tcPr>
-            <w:tcW w:type="dxa" w:w="3486"/>
+            <w:tcW w:type="dxa" w:w="3655"/>
           </w:tcPr>
           <w:p>
             <w:pPr>
@@ -1450,7 +1336,7 @@
       <w:tr>
         <w:tc>
           <w:tcPr>
-            <w:tcW w:type="dxa" w:w="4183"/>
+            <w:tcW w:type="dxa" w:w="3929"/>
           </w:tcPr>
           <w:p>
             <w:pPr>
@@ -1468,7 +1354,7 @@
         </w:tc>
         <w:tc>
           <w:tcPr>
-            <w:tcW w:type="dxa" w:w="1743"/>
+            <w:tcW w:type="dxa" w:w="1827"/>
           </w:tcPr>
           <w:p>
             <w:pPr>
@@ -1486,7 +1372,7 @@
         </w:tc>
         <w:tc>
           <w:tcPr>
-            <w:tcW w:type="dxa" w:w="3486"/>
+            <w:tcW w:type="dxa" w:w="3655"/>
           </w:tcPr>
           <w:p>
             <w:pPr>
@@ -1506,7 +1392,7 @@
       <w:tr>
         <w:tc>
           <w:tcPr>
-            <w:tcW w:type="dxa" w:w="4183"/>
+            <w:tcW w:type="dxa" w:w="3929"/>
           </w:tcPr>
           <w:p>
             <w:pPr>
@@ -1518,13 +1404,13 @@
                 <w:sz w:val="20"/>
                 <w:szCs w:val="20"/>
               </w:rPr>
-              <w:t>สายจัมเปอร์ตัวเมีย-ตัวเมีย 3 เส้น</w:t>
+              <w:t>สายจัมเปอร์</w:t>
             </w:r>
           </w:p>
         </w:tc>
         <w:tc>
           <w:tcPr>
-            <w:tcW w:type="dxa" w:w="1743"/>
+            <w:tcW w:type="dxa" w:w="1827"/>
           </w:tcPr>
           <w:p>
             <w:pPr>
@@ -1536,13 +1422,13 @@
                 <w:sz w:val="20"/>
                 <w:szCs w:val="20"/>
               </w:rPr>
-              <w:t>1 ชุด</w:t>
+              <w:t>3 เส้น</w:t>
             </w:r>
           </w:p>
         </w:tc>
         <w:tc>
           <w:tcPr>
-            <w:tcW w:type="dxa" w:w="3486"/>
+            <w:tcW w:type="dxa" w:w="3655"/>
           </w:tcPr>
           <w:p>
             <w:pPr>
@@ -1555,62 +1441,6 @@
                 <w:szCs w:val="20"/>
               </w:rPr>
               <w:t>เชื่อมบอร์ด (TX, RX, GND)</w:t>
-            </w:r>
-          </w:p>
-        </w:tc>
-      </w:tr>
-      <w:tr>
-        <w:tc>
-          <w:tcPr>
-            <w:tcW w:type="dxa" w:w="4183"/>
-          </w:tcPr>
-          <w:p>
-            <w:pPr>
-              <w:spacing w:after="0"/>
-            </w:pPr>
-            <w:r>
-              <w:rPr>
-                <w:rFonts w:ascii="Sarabun" w:hAnsi="Sarabun" w:cs="Sarabun" w:eastAsia="Sarabun"/>
-                <w:sz w:val="20"/>
-                <w:szCs w:val="20"/>
-              </w:rPr>
-              <w:t>คอมพิวเตอร์ + Vivado 2025.2 / FPGA Builder</w:t>
-            </w:r>
-          </w:p>
-        </w:tc>
-        <w:tc>
-          <w:tcPr>
-            <w:tcW w:type="dxa" w:w="1743"/>
-          </w:tcPr>
-          <w:p>
-            <w:pPr>
-              <w:spacing w:after="0"/>
-            </w:pPr>
-            <w:r>
-              <w:rPr>
-                <w:rFonts w:ascii="Sarabun" w:hAnsi="Sarabun" w:cs="Sarabun" w:eastAsia="Sarabun"/>
-                <w:sz w:val="20"/>
-                <w:szCs w:val="20"/>
-              </w:rPr>
-              <w:t>1</w:t>
-            </w:r>
-          </w:p>
-        </w:tc>
-        <w:tc>
-          <w:tcPr>
-            <w:tcW w:type="dxa" w:w="3486"/>
-          </w:tcPr>
-          <w:p>
-            <w:pPr>
-              <w:spacing w:after="0"/>
-            </w:pPr>
-            <w:r>
-              <w:rPr>
-                <w:rFonts w:ascii="Sarabun" w:hAnsi="Sarabun" w:cs="Sarabun" w:eastAsia="Sarabun"/>
-                <w:sz w:val="20"/>
-                <w:szCs w:val="20"/>
-              </w:rPr>
-              <w:t>สังเคราะห์วงจรและโหลดลงบอร์ด</w:t>
             </w:r>
           </w:p>
         </w:tc>
@@ -1640,7 +1470,7 @@
       <w:r>
         <w:drawing>
           <wp:inline xmlns:a="http://schemas.openxmlformats.org/drawingml/2006/main" xmlns:pic="http://schemas.openxmlformats.org/drawingml/2006/picture">
-            <wp:extent cx="5940000" cy="2831860"/>
+            <wp:extent cx="5940000" cy="3346479"/>
             <wp:docPr id="2" name="Picture 2"/>
             <wp:cNvGraphicFramePr>
               <a:graphicFrameLocks noChangeAspect="1"/>
@@ -1649,11 +1479,11 @@
               <a:graphicData uri="http://schemas.openxmlformats.org/drawingml/2006/picture">
                 <pic:pic>
                   <pic:nvPicPr>
-                    <pic:cNvPr id="0" name="fig_hierarchy.png"/>
+                    <pic:cNvPr id="0" name="fig_plan.png"/>
                     <pic:cNvPicPr/>
                   </pic:nvPicPr>
                   <pic:blipFill>
-                    <a:blip r:embed="rId10"/>
+                    <a:blip r:embed="rId11"/>
                     <a:stretch>
                       <a:fillRect/>
                     </a:stretch>
@@ -1661,7 +1491,7 @@
                   <pic:spPr>
                     <a:xfrm>
                       <a:off x="0" y="0"/>
-                      <a:ext cx="5940000" cy="2831860"/>
+                      <a:ext cx="5940000" cy="3346479"/>
                     </a:xfrm>
                     <a:prstGeom prst="rect"/>
                   </pic:spPr>
@@ -1679,165 +1509,33 @@
       <w:r>
         <w:rPr>
           <w:rFonts w:ascii="Sarabun" w:hAnsi="Sarabun" w:cs="Sarabun" w:eastAsia="Sarabun"/>
-          <w:i/>
-          <w:color w:val="5B6475"/>
+          <w:b/>
+          <w:color w:val="000000"/>
           <w:sz w:val="20"/>
           <w:szCs w:val="20"/>
+          <w:bCs/>
         </w:rPr>
-        <w:t>โครงสร้างแบบ Top-Down: ระบบแบ่งเป็นโมดูล</w:t>
-      </w:r>
-    </w:p>
-    <w:p>
-      <w:r>
-        <w:rPr>
-          <w:rFonts w:ascii="Sarabun" w:hAnsi="Sarabun" w:cs="Sarabun" w:eastAsia="Sarabun"/>
-        </w:rPr>
-        <w:t>ระบบออกแบบแบบ Top-Down: เริ่มจากระบบทั้งหมด (2 บอร์ด) → วงจรในหนึ่งบอร์ด (</w:t>
-      </w:r>
-      <w:r>
-        <w:rPr>
-          <w:rFonts w:ascii="Consolas" w:hAnsi="Consolas" w:cs="Consolas" w:eastAsia="Consolas"/>
-          <w:color w:val="9D174D"/>
-          <w:sz w:val="20"/>
-          <w:szCs w:val="20"/>
-        </w:rPr>
-        <w:t>top_tetris</w:t>
+        <w:t xml:space="preserve">ภาพที่ 2 </w:t>
       </w:r>
       <w:r>
         <w:rPr>
           <w:rFonts w:ascii="Sarabun" w:hAnsi="Sarabun" w:cs="Sarabun" w:eastAsia="Sarabun"/>
+          <w:color w:val="555B66"/>
+          <w:sz w:val="20"/>
+          <w:szCs w:val="20"/>
         </w:rPr>
-        <w:t>) → แบ่งเป็นกลุ่มหน้าที่ ได้แก่ รับอินพุต, กติกาเกม, การสื่อสาร, CHAOS, ภาพ, สื่อจากแฟลช และเสียง → แต่ละกลุ่มแบ่งเป็นโมดูล VHDL ที่ทดสอบแยกกันได้ ทั้งหมดทำงานด้วยสัญญาณนาฬิกา 50 MHz ตัวเดียว (รายละเอียดอยู่ใน Design Document)</w:t>
+        <w:t>หลักการทำงานในหนึ่งบอร์ด: ส่วนต่างๆ ของวงจรที่จะสร้างใน FPGA และข้อมูลที่ส่งถึงกัน</w:t>
       </w:r>
     </w:p>
     <w:p>
       <w:pPr>
-        <w:pStyle w:val="Heading2"/>
+        <w:ind w:firstLine="567"/>
       </w:pPr>
       <w:r>
         <w:rPr>
           <w:rFonts w:ascii="Sarabun" w:hAnsi="Sarabun" w:cs="Sarabun" w:eastAsia="Sarabun"/>
         </w:rPr>
-        <w:t>8. ความยากและความท้าทาย</w:t>
-      </w:r>
-    </w:p>
-    <w:p>
-      <w:r>
-        <w:rPr>
-          <w:rFonts w:ascii="Sarabun" w:hAnsi="Sarabun" w:cs="Sarabun" w:eastAsia="Sarabun"/>
-        </w:rPr>
-        <w:t>เทียบกับแลปในรายวิชา ชิ้นงานนี้ยากกว่าในหลายด้าน:</w:t>
-      </w:r>
-    </w:p>
-    <w:p>
-      <w:pPr>
-        <w:pStyle w:val="ListBullet"/>
-        <w:spacing w:after="40"/>
-      </w:pPr>
-      <w:r>
-        <w:rPr>
-          <w:rFonts w:ascii="Sarabun" w:hAnsi="Sarabun" w:cs="Sarabun" w:eastAsia="Sarabun"/>
-          <w:b/>
-          <w:bCs/>
-        </w:rPr>
-        <w:t>ขนาด</w:t>
-      </w:r>
-      <w:r>
-        <w:rPr>
-          <w:rFonts w:ascii="Sarabun" w:hAnsi="Sarabun" w:cs="Sarabun" w:eastAsia="Sarabun"/>
-        </w:rPr>
-        <w:t>: ตัวเกมเป็นโค้ด VHDL ประมาณ 5,700 บรรทัด 25 ไฟล์ ใช้ชิปไป 85 % ของ LUT และ block RAM ครบทั้ง 100 % ต้องปรับโครงสร้างหลายรอบเพื่อให้วงจรใส่ชิปได้</w:t>
-      </w:r>
-    </w:p>
-    <w:p>
-      <w:pPr>
-        <w:pStyle w:val="ListBullet"/>
-        <w:spacing w:after="40"/>
-      </w:pPr>
-      <w:r>
-        <w:rPr>
-          <w:rFonts w:ascii="Sarabun" w:hAnsi="Sarabun" w:cs="Sarabun" w:eastAsia="Sarabun"/>
-          <w:b/>
-          <w:bCs/>
-        </w:rPr>
-        <w:t>State machine ซับซ้อน</w:t>
-      </w:r>
-      <w:r>
-        <w:rPr>
-          <w:rFonts w:ascii="Sarabun" w:hAnsi="Sarabun" w:cs="Sarabun" w:eastAsia="Sarabun"/>
-        </w:rPr>
-        <w:t>: ตัวเกมมี 23 สถานะ ใช้ตัวตรวจการชนเพียงตัวเดียวร่วมกันเพื่อประหยัดวงจร</w:t>
-      </w:r>
-    </w:p>
-    <w:p>
-      <w:pPr>
-        <w:pStyle w:val="ListBullet"/>
-        <w:spacing w:after="40"/>
-      </w:pPr>
-      <w:r>
-        <w:rPr>
-          <w:rFonts w:ascii="Sarabun" w:hAnsi="Sarabun" w:cs="Sarabun" w:eastAsia="Sarabun"/>
-          <w:b/>
-          <w:bCs/>
-        </w:rPr>
-        <w:t>สองบอร์ดต้องตกลงกันได้</w:t>
-      </w:r>
-      <w:r>
-        <w:rPr>
-          <w:rFonts w:ascii="Sarabun" w:hAnsi="Sarabun" w:cs="Sarabun" w:eastAsia="Sarabun"/>
-        </w:rPr>
-        <w:t>: การเริ่มเกมพร้อมกัน, การรู้ว่าสายหลุด, การตัดสินเสมอเมื่อแพ้ใกล้เคียงกัน</w:t>
-      </w:r>
-    </w:p>
-    <w:p>
-      <w:pPr>
-        <w:pStyle w:val="ListBullet"/>
-        <w:spacing w:after="40"/>
-      </w:pPr>
-      <w:r>
-        <w:rPr>
-          <w:rFonts w:ascii="Sarabun" w:hAnsi="Sarabun" w:cs="Sarabun" w:eastAsia="Sarabun"/>
-          <w:b/>
-          <w:bCs/>
-        </w:rPr>
-        <w:t>ภาพและเสียงจากแฟลช</w:t>
-      </w:r>
-      <w:r>
-        <w:rPr>
-          <w:rFonts w:ascii="Sarabun" w:hAnsi="Sarabun" w:cs="Sarabun" w:eastAsia="Sarabun"/>
-        </w:rPr>
-        <w:t>: ต้องอ่านแฟลชแบบ SPI 25 MHz, ถอดรหัสภาพแบบ run-length และเสียงแบบ ADPCM แบบเรียลไทม์ พร้อมรักษาจังหวะภาพกับเสียงให้ตรงกัน</w:t>
-      </w:r>
-    </w:p>
-    <w:p>
-      <w:pPr>
-        <w:pStyle w:val="ListBullet"/>
-        <w:spacing w:after="40"/>
-      </w:pPr>
-      <w:r>
-        <w:rPr>
-          <w:rFonts w:ascii="Sarabun" w:hAnsi="Sarabun" w:cs="Sarabun" w:eastAsia="Sarabun"/>
-          <w:b/>
-          <w:bCs/>
-        </w:rPr>
-        <w:t>รูปแบบไฟล์สื่อออกแบบเอง</w:t>
-      </w:r>
-      <w:r>
-        <w:rPr>
-          <w:rFonts w:ascii="Sarabun" w:hAnsi="Sarabun" w:cs="Sarabun" w:eastAsia="Sarabun"/>
-        </w:rPr>
-        <w:t>: เขียนโปรแกรม Python แปลงวิดีโอ เพลง และรูป ให้อยู่ในรูปแบบที่วงจรอ่านได้</w:t>
-      </w:r>
-    </w:p>
-    <w:p>
-      <w:pPr>
-        <w:pStyle w:val="Heading2"/>
-      </w:pPr>
-      <w:r>
-        <w:rPr>
-          <w:rFonts w:ascii="Sarabun" w:hAnsi="Sarabun" w:cs="Sarabun" w:eastAsia="Sarabun"/>
-        </w:rPr>
-        <w:t>9. ประโยชน์ที่คาดว่าจะได้รับ</w:t>
+        <w:t>วงจรในแต่ละบอร์ดแบ่งเป็นส่วนตามหน้าที่ ทุกส่วนทำงานพร้อมกันตลอดเวลาด้วยสัญญาณนาฬิกา 50 MHz ตัวเดียว:</w:t>
       </w:r>
     </w:p>
     <w:p>
@@ -1852,8 +1550,16 @@
       <w:r>
         <w:rPr>
           <w:rFonts w:ascii="Sarabun" w:hAnsi="Sarabun" w:cs="Sarabun" w:eastAsia="Sarabun"/>
+          <w:b/>
+          <w:bCs/>
         </w:rPr>
-        <w:t>เข้าใจการออกแบบระบบดิจิทัลขนาดใหญ่แบบ Top-Down และการแบ่งงานเป็นโมดูล</w:t>
+        <w:t>รับอินพุต</w:t>
+      </w:r>
+      <w:r>
+        <w:rPr>
+          <w:rFonts w:ascii="Sarabun" w:hAnsi="Sarabun" w:cs="Sarabun" w:eastAsia="Sarabun"/>
+        </w:rPr>
+        <w:t>: ปุ่มกดผ่านวงจรกรองสัญญาณเด้ง (debounce) แล้วแปลงเป็นคำสั่ง ซ้าย ขวา หมุน ตก ถ้ากดค้างจะส่งคำสั่งซ้ำเป็นจังหวะ</w:t>
       </w:r>
     </w:p>
     <w:p>
@@ -1862,6 +1568,202 @@
         <w:numPr>
           <w:ilvl w:val="0"/>
           <w:numId w:val="15"/>
+        </w:numPr>
+        <w:spacing w:after="40"/>
+      </w:pPr>
+      <w:r>
+        <w:rPr>
+          <w:rFonts w:ascii="Sarabun" w:hAnsi="Sarabun" w:cs="Sarabun" w:eastAsia="Sarabun"/>
+          <w:b/>
+          <w:bCs/>
+        </w:rPr>
+        <w:t>กติกาเกม</w:t>
+      </w:r>
+      <w:r>
+        <w:rPr>
+          <w:rFonts w:ascii="Sarabun" w:hAnsi="Sarabun" w:cs="Sarabun" w:eastAsia="Sarabun"/>
+        </w:rPr>
+        <w:t>: state machine รับคำสั่ง ขยับบล็อก ตรวจการชน ล้างแถว และนับคะแนน กระดานเก็บในหน่วยความจำภายในชิป บล็อกถัดไปสุ่มด้วย LFSR</w:t>
+      </w:r>
+    </w:p>
+    <w:p>
+      <w:pPr>
+        <w:pStyle w:val="ListNumber"/>
+        <w:numPr>
+          <w:ilvl w:val="0"/>
+          <w:numId w:val="15"/>
+        </w:numPr>
+        <w:spacing w:after="40"/>
+      </w:pPr>
+      <w:r>
+        <w:rPr>
+          <w:rFonts w:ascii="Sarabun" w:hAnsi="Sarabun" w:cs="Sarabun" w:eastAsia="Sarabun"/>
+          <w:b/>
+          <w:bCs/>
+        </w:rPr>
+        <w:t>การสื่อสาร</w:t>
+      </w:r>
+      <w:r>
+        <w:rPr>
+          <w:rFonts w:ascii="Sarabun" w:hAnsi="Sarabun" w:cs="Sarabun" w:eastAsia="Sarabun"/>
+        </w:rPr>
+        <w:t>: เมื่อล้างหลายแถวพร้อมกัน ส่งข้อความผ่าน UART ไปอีกบอร์ดเพื่อเพิ่มแถวขยะ และรับข้อความจากอีกบอร์ด (ขยะ, ความสูงกอง, แพ้, เริ่มเกม) ถ้าไม่ได้รับข้อความเลยสักพัก แสดงว่าสายหลุด</w:t>
+      </w:r>
+    </w:p>
+    <w:p>
+      <w:pPr>
+        <w:pStyle w:val="ListNumber"/>
+        <w:numPr>
+          <w:ilvl w:val="0"/>
+          <w:numId w:val="15"/>
+        </w:numPr>
+        <w:spacing w:after="40"/>
+      </w:pPr>
+      <w:r>
+        <w:rPr>
+          <w:rFonts w:ascii="Sarabun" w:hAnsi="Sarabun" w:cs="Sarabun" w:eastAsia="Sarabun"/>
+          <w:b/>
+          <w:bCs/>
+        </w:rPr>
+        <w:t>ภารกิจ CHAOS</w:t>
+      </w:r>
+      <w:r>
+        <w:rPr>
+          <w:rFonts w:ascii="Sarabun" w:hAnsi="Sarabun" w:cs="Sarabun" w:eastAsia="Sarabun"/>
+        </w:rPr>
+        <w:t>: สุ่มภารกิจ ตรวจตำแหน่งสวิตช์และจับเวลา ทำสำเร็จแล้วสุ่มว่าจะได้โจมตีหรือโบนัส การโจมตีส่งไปอีกบอร์ดผ่านสายเดียวกัน</w:t>
+      </w:r>
+    </w:p>
+    <w:p>
+      <w:pPr>
+        <w:pStyle w:val="ListNumber"/>
+        <w:numPr>
+          <w:ilvl w:val="0"/>
+          <w:numId w:val="15"/>
+        </w:numPr>
+        <w:spacing w:after="40"/>
+      </w:pPr>
+      <w:r>
+        <w:rPr>
+          <w:rFonts w:ascii="Sarabun" w:hAnsi="Sarabun" w:cs="Sarabun" w:eastAsia="Sarabun"/>
+          <w:b/>
+          <w:bCs/>
+        </w:rPr>
+        <w:t>สร้างภาพ VGA</w:t>
+      </w:r>
+      <w:r>
+        <w:rPr>
+          <w:rFonts w:ascii="Sarabun" w:hAnsi="Sarabun" w:cs="Sarabun" w:eastAsia="Sarabun"/>
+        </w:rPr>
+        <w:t>: นับตำแหน่งพิกเซลตามจังหวะของจอ แล้วคำนวณสีของพิกเซลนั้นจากสถานะเกม ซ้อนด้วยภาพของ CHAOS และวิดีโอจากแฟลชเป็นพื้นหลัง</w:t>
+      </w:r>
+    </w:p>
+    <w:p>
+      <w:pPr>
+        <w:pStyle w:val="ListNumber"/>
+        <w:numPr>
+          <w:ilvl w:val="0"/>
+          <w:numId w:val="15"/>
+        </w:numPr>
+        <w:spacing w:after="40"/>
+      </w:pPr>
+      <w:r>
+        <w:rPr>
+          <w:rFonts w:ascii="Sarabun" w:hAnsi="Sarabun" w:cs="Sarabun" w:eastAsia="Sarabun"/>
+          <w:b/>
+          <w:bCs/>
+        </w:rPr>
+        <w:t>อ่านสื่อจากแฟลช</w:t>
+      </w:r>
+      <w:r>
+        <w:rPr>
+          <w:rFonts w:ascii="Sarabun" w:hAnsi="Sarabun" w:cs="Sarabun" w:eastAsia="Sarabun"/>
+        </w:rPr>
+        <w:t>: อ่านข้อมูลจากชิปแฟลชผ่าน SPI ถอดภาพวิดีโอลงหน่วยความจำภาพ และถอดรหัสเสียง</w:t>
+      </w:r>
+    </w:p>
+    <w:p>
+      <w:pPr>
+        <w:pStyle w:val="ListNumber"/>
+        <w:numPr>
+          <w:ilvl w:val="0"/>
+          <w:numId w:val="15"/>
+        </w:numPr>
+        <w:spacing w:after="40"/>
+      </w:pPr>
+      <w:r>
+        <w:rPr>
+          <w:rFonts w:ascii="Sarabun" w:hAnsi="Sarabun" w:cs="Sarabun" w:eastAsia="Sarabun"/>
+          <w:b/>
+          <w:bCs/>
+        </w:rPr>
+        <w:t>เสียง</w:t>
+      </w:r>
+      <w:r>
+        <w:rPr>
+          <w:rFonts w:ascii="Sarabun" w:hAnsi="Sarabun" w:cs="Sarabun" w:eastAsia="Sarabun"/>
+        </w:rPr>
+        <w:t>: ผสมเพลงกับเสียงเอฟเฟกต์ แล้วส่งออกขา FPGA ไปยังช่องหูฟังโดยตรง</w:t>
+      </w:r>
+    </w:p>
+    <w:p>
+      <w:pPr>
+        <w:ind w:firstLine="567"/>
+      </w:pPr>
+      <w:r>
+        <w:rPr>
+          <w:rFonts w:ascii="Sarabun" w:hAnsi="Sarabun" w:cs="Sarabun" w:eastAsia="Sarabun"/>
+        </w:rPr>
+        <w:t xml:space="preserve">การออกแบบใช้กระบวนการ </w:t>
+      </w:r>
+      <w:r>
+        <w:rPr>
+          <w:rFonts w:ascii="Sarabun" w:hAnsi="Sarabun" w:cs="Sarabun" w:eastAsia="Sarabun"/>
+          <w:b/>
+          <w:bCs/>
+        </w:rPr>
+        <w:t>Top-Down</w:t>
+      </w:r>
+      <w:r>
+        <w:rPr>
+          <w:rFonts w:ascii="Sarabun" w:hAnsi="Sarabun" w:cs="Sarabun" w:eastAsia="Sarabun"/>
+        </w:rPr>
+        <w:t>: เริ่มจากระบบทั้งหมด (2 บอร์ด) → วงจรในหนึ่งบอร์ด → ส่วนต่างๆ ตามภาพด้านบน → แบ่งแต่ละส่วนเป็นโมดูล VHDL ที่ทดสอบแยกกันได้ด้วย simulation ก่อนนำไปประกอบและทดสอบบนบอร์ดจริง (รายละเอียดการออกแบบจริงอยู่ใน Design Document)</w:t>
+      </w:r>
+    </w:p>
+    <w:p>
+      <w:pPr>
+        <w:pStyle w:val="Heading2"/>
+      </w:pPr>
+      <w:r>
+        <w:rPr>
+          <w:rFonts w:ascii="Sarabun" w:hAnsi="Sarabun" w:cs="Sarabun" w:eastAsia="Sarabun"/>
+        </w:rPr>
+        <w:t>8. ประโยชน์ที่คาดว่าจะได้รับ</w:t>
+      </w:r>
+    </w:p>
+    <w:p>
+      <w:pPr>
+        <w:pStyle w:val="ListNumber"/>
+        <w:numPr>
+          <w:ilvl w:val="0"/>
+          <w:numId w:val="16"/>
+        </w:numPr>
+        <w:spacing w:after="40"/>
+      </w:pPr>
+      <w:r>
+        <w:rPr>
+          <w:rFonts w:ascii="Sarabun" w:hAnsi="Sarabun" w:cs="Sarabun" w:eastAsia="Sarabun"/>
+        </w:rPr>
+        <w:t>เข้าใจการออกแบบระบบดิจิทัลขนาดใหญ่ และการแบ่งงานเป็นโมดูล</w:t>
+      </w:r>
+    </w:p>
+    <w:p>
+      <w:pPr>
+        <w:pStyle w:val="ListNumber"/>
+        <w:numPr>
+          <w:ilvl w:val="0"/>
+          <w:numId w:val="16"/>
         </w:numPr>
         <w:spacing w:after="40"/>
       </w:pPr>
@@ -1877,7 +1779,7 @@
         <w:pStyle w:val="ListNumber"/>
         <w:numPr>
           <w:ilvl w:val="0"/>
-          <w:numId w:val="15"/>
+          <w:numId w:val="16"/>
         </w:numPr>
         <w:spacing w:after="40"/>
       </w:pPr>
@@ -1893,7 +1795,7 @@
         <w:pStyle w:val="ListNumber"/>
         <w:numPr>
           <w:ilvl w:val="0"/>
-          <w:numId w:val="15"/>
+          <w:numId w:val="16"/>
         </w:numPr>
         <w:spacing w:after="40"/>
       </w:pPr>
@@ -1901,619 +1803,70 @@
         <w:rPr>
           <w:rFonts w:ascii="Sarabun" w:hAnsi="Sarabun" w:cs="Sarabun" w:eastAsia="Sarabun"/>
         </w:rPr>
-        <w:t>ได้เกมที่เล่นสนุกกับเพื่อนได้จริง และเป็นตัวอย่างให้รุ่นต่อไปเห็นว่า FPGA ทำอะไรได้บ้าง (โค้ดทุกไฟล์มีคำอธิบายและเอกสารประกอบภาษาอังกฤษแบบละเอียด)</w:t>
+        <w:t>ได้เกมที่เล่นสนุกกับเพื่อนได้จริง และเป็นตัวอย่างให้รุ่นต่อไปเห็นว่า FPGA ทำอะไรได้บ้าง (ตั้งใจเขียนคำอธิบายในโค้ดและเอกสารประกอบอย่างละเอียด)</w:t>
       </w:r>
     </w:p>
-    <w:p>
-      <w:pPr>
-        <w:pStyle w:val="Heading2"/>
-      </w:pPr>
-      <w:r>
-        <w:rPr>
-          <w:rFonts w:ascii="Sarabun" w:hAnsi="Sarabun" w:cs="Sarabun" w:eastAsia="Sarabun"/>
-        </w:rPr>
-        <w:t>10. แผนการดำเนินงาน</w:t>
-      </w:r>
-    </w:p>
-    <w:tbl>
-      <w:tblPr>
-        <w:tblStyle w:val="TableGrid"/>
-        <w:tblW w:type="auto" w:w="0"/>
-        <w:jc w:val="center"/>
-        <w:tblLayout w:type="fixed"/>
-        <w:tblLook w:firstColumn="1" w:firstRow="1" w:lastColumn="0" w:lastRow="0" w:noHBand="0" w:noVBand="1" w:val="04A0"/>
-      </w:tblPr>
-      <w:tblGrid>
-        <w:gridCol w:w="4706"/>
-        <w:gridCol w:w="4706"/>
-      </w:tblGrid>
-      <w:tr>
-        <w:tc>
-          <w:tcPr>
-            <w:tcW w:type="dxa" w:w="2745"/>
-            <w:shd w:val="clear" w:color="auto" w:fill="EDE9FE"/>
-          </w:tcPr>
-          <w:p>
-            <w:pPr>
-              <w:spacing w:after="0"/>
-            </w:pPr>
-            <w:r>
-              <w:rPr>
-                <w:rFonts w:ascii="Sarabun" w:hAnsi="Sarabun" w:cs="Sarabun" w:eastAsia="Sarabun"/>
-                <w:b/>
-                <w:sz w:val="20"/>
-                <w:szCs w:val="20"/>
-                <w:bCs/>
-              </w:rPr>
-              <w:t>ช่วงเวลา (2569)</w:t>
-            </w:r>
-          </w:p>
-        </w:tc>
-        <w:tc>
-          <w:tcPr>
-            <w:tcW w:type="dxa" w:w="6666"/>
-            <w:shd w:val="clear" w:color="auto" w:fill="EDE9FE"/>
-          </w:tcPr>
-          <w:p>
-            <w:pPr>
-              <w:spacing w:after="0"/>
-            </w:pPr>
-            <w:r>
-              <w:rPr>
-                <w:rFonts w:ascii="Sarabun" w:hAnsi="Sarabun" w:cs="Sarabun" w:eastAsia="Sarabun"/>
-                <w:b/>
-                <w:sz w:val="20"/>
-                <w:szCs w:val="20"/>
-                <w:bCs/>
-              </w:rPr>
-              <w:t>งาน</w:t>
-            </w:r>
-          </w:p>
-        </w:tc>
-      </w:tr>
-      <w:tr>
-        <w:tc>
-          <w:tcPr>
-            <w:tcW w:type="dxa" w:w="2745"/>
-          </w:tcPr>
-          <w:p>
-            <w:pPr>
-              <w:spacing w:after="0"/>
-            </w:pPr>
-            <w:r>
-              <w:rPr>
-                <w:rFonts w:ascii="Sarabun" w:hAnsi="Sarabun" w:cs="Sarabun" w:eastAsia="Sarabun"/>
-                <w:sz w:val="20"/>
-                <w:szCs w:val="20"/>
-              </w:rPr>
-              <w:t>ต้น ต.ค.</w:t>
-            </w:r>
-          </w:p>
-        </w:tc>
-        <w:tc>
-          <w:tcPr>
-            <w:tcW w:type="dxa" w:w="6666"/>
-          </w:tcPr>
-          <w:p>
-            <w:pPr>
-              <w:spacing w:after="0"/>
-            </w:pPr>
-            <w:r>
-              <w:rPr>
-                <w:rFonts w:ascii="Sarabun" w:hAnsi="Sarabun" w:cs="Sarabun" w:eastAsia="Sarabun"/>
-                <w:sz w:val="20"/>
-                <w:szCs w:val="20"/>
-              </w:rPr>
-              <w:t>เลือกหัวข้อ, ศึกษาคู่มือบอร์ด, ตั้งค่าเครื่องมือ</w:t>
-            </w:r>
-          </w:p>
-        </w:tc>
-      </w:tr>
-      <w:tr>
-        <w:tc>
-          <w:tcPr>
-            <w:tcW w:type="dxa" w:w="2745"/>
-          </w:tcPr>
-          <w:p>
-            <w:pPr>
-              <w:spacing w:after="0"/>
-            </w:pPr>
-            <w:r>
-              <w:rPr>
-                <w:rFonts w:ascii="Sarabun" w:hAnsi="Sarabun" w:cs="Sarabun" w:eastAsia="Sarabun"/>
-                <w:sz w:val="20"/>
-                <w:szCs w:val="20"/>
-              </w:rPr>
-              <w:t>15-16 ต.ค.</w:t>
-            </w:r>
-          </w:p>
-        </w:tc>
-        <w:tc>
-          <w:tcPr>
-            <w:tcW w:type="dxa" w:w="6666"/>
-          </w:tcPr>
-          <w:p>
-            <w:pPr>
-              <w:spacing w:after="0"/>
-            </w:pPr>
-            <w:r>
-              <w:rPr>
-                <w:rFonts w:ascii="Sarabun" w:hAnsi="Sarabun" w:cs="Sarabun" w:eastAsia="Sarabun"/>
-                <w:sz w:val="20"/>
-                <w:szCs w:val="20"/>
-              </w:rPr>
-              <w:t>วงจรทดสอบฮาร์ดแวร์ 01-05 (VGA, ขา J5, UART)</w:t>
-            </w:r>
-          </w:p>
-        </w:tc>
-      </w:tr>
-      <w:tr>
-        <w:tc>
-          <w:tcPr>
-            <w:tcW w:type="dxa" w:w="2745"/>
-          </w:tcPr>
-          <w:p>
-            <w:pPr>
-              <w:spacing w:after="0"/>
-            </w:pPr>
-            <w:r>
-              <w:rPr>
-                <w:rFonts w:ascii="Sarabun" w:hAnsi="Sarabun" w:cs="Sarabun" w:eastAsia="Sarabun"/>
-                <w:sz w:val="20"/>
-                <w:szCs w:val="20"/>
-              </w:rPr>
-              <w:t>17-19 ต.ค.</w:t>
-            </w:r>
-          </w:p>
-        </w:tc>
-        <w:tc>
-          <w:tcPr>
-            <w:tcW w:type="dxa" w:w="6666"/>
-          </w:tcPr>
-          <w:p>
-            <w:pPr>
-              <w:spacing w:after="0"/>
-            </w:pPr>
-            <w:r>
-              <w:rPr>
-                <w:rFonts w:ascii="Sarabun" w:hAnsi="Sarabun" w:cs="Sarabun" w:eastAsia="Sarabun"/>
-                <w:sz w:val="20"/>
-                <w:szCs w:val="20"/>
-              </w:rPr>
-              <w:t>ชั้นที่ 1: ตัวเกม + โหมดต่อสู้ → ทดลองเล่นบนบอร์ดจริง 2 บอร์ด</w:t>
-            </w:r>
-          </w:p>
-        </w:tc>
-      </w:tr>
-      <w:tr>
-        <w:tc>
-          <w:tcPr>
-            <w:tcW w:type="dxa" w:w="2745"/>
-          </w:tcPr>
-          <w:p>
-            <w:pPr>
-              <w:spacing w:after="0"/>
-            </w:pPr>
-            <w:r>
-              <w:rPr>
-                <w:rFonts w:ascii="Sarabun" w:hAnsi="Sarabun" w:cs="Sarabun" w:eastAsia="Sarabun"/>
-                <w:sz w:val="20"/>
-                <w:szCs w:val="20"/>
-              </w:rPr>
-              <w:t>19 ต.ค.</w:t>
-            </w:r>
-          </w:p>
-        </w:tc>
-        <w:tc>
-          <w:tcPr>
-            <w:tcW w:type="dxa" w:w="6666"/>
-          </w:tcPr>
-          <w:p>
-            <w:pPr>
-              <w:spacing w:after="0"/>
-            </w:pPr>
-            <w:r>
-              <w:rPr>
-                <w:rFonts w:ascii="Sarabun" w:hAnsi="Sarabun" w:cs="Sarabun" w:eastAsia="Sarabun"/>
-                <w:sz w:val="20"/>
-                <w:szCs w:val="20"/>
-              </w:rPr>
-              <w:t>ชั้นที่ 2: โหมด CHAOS → เล่นทดสอบ ปรับตามความเห็น 2 รอบ</w:t>
-            </w:r>
-          </w:p>
-        </w:tc>
-      </w:tr>
-      <w:tr>
-        <w:tc>
-          <w:tcPr>
-            <w:tcW w:type="dxa" w:w="2745"/>
-          </w:tcPr>
-          <w:p>
-            <w:pPr>
-              <w:spacing w:after="0"/>
-            </w:pPr>
-            <w:r>
-              <w:rPr>
-                <w:rFonts w:ascii="Sarabun" w:hAnsi="Sarabun" w:cs="Sarabun" w:eastAsia="Sarabun"/>
-                <w:sz w:val="20"/>
-                <w:szCs w:val="20"/>
-              </w:rPr>
-              <w:t>20-21 ต.ค.</w:t>
-            </w:r>
-          </w:p>
-        </w:tc>
-        <w:tc>
-          <w:tcPr>
-            <w:tcW w:type="dxa" w:w="6666"/>
-          </w:tcPr>
-          <w:p>
-            <w:pPr>
-              <w:spacing w:after="0"/>
-            </w:pPr>
-            <w:r>
-              <w:rPr>
-                <w:rFonts w:ascii="Sarabun" w:hAnsi="Sarabun" w:cs="Sarabun" w:eastAsia="Sarabun"/>
-                <w:sz w:val="20"/>
-                <w:szCs w:val="20"/>
-              </w:rPr>
-              <w:t>ชั้นที่ 3: สื่อจากแฟลช (ทดสอบ 06 → ใส่ในเกม) → ทดสอบบนบอร์ดจริง</w:t>
-            </w:r>
-          </w:p>
-        </w:tc>
-      </w:tr>
-      <w:tr>
-        <w:tc>
-          <w:tcPr>
-            <w:tcW w:type="dxa" w:w="2745"/>
-          </w:tcPr>
-          <w:p>
-            <w:pPr>
-              <w:spacing w:after="0"/>
-            </w:pPr>
-            <w:r>
-              <w:rPr>
-                <w:rFonts w:ascii="Sarabun" w:hAnsi="Sarabun" w:cs="Sarabun" w:eastAsia="Sarabun"/>
-                <w:sz w:val="20"/>
-                <w:szCs w:val="20"/>
-              </w:rPr>
-              <w:t>22-29 ต.ค.</w:t>
-            </w:r>
-          </w:p>
-        </w:tc>
-        <w:tc>
-          <w:tcPr>
-            <w:tcW w:type="dxa" w:w="6666"/>
-          </w:tcPr>
-          <w:p>
-            <w:pPr>
-              <w:spacing w:after="0"/>
-            </w:pPr>
-            <w:r>
-              <w:rPr>
-                <w:rFonts w:ascii="Sarabun" w:hAnsi="Sarabun" w:cs="Sarabun" w:eastAsia="Sarabun"/>
-                <w:sz w:val="20"/>
-                <w:szCs w:val="20"/>
-              </w:rPr>
-              <w:t>เอกสาร, Brochure, วิดีโอ</w:t>
-            </w:r>
-          </w:p>
-        </w:tc>
-      </w:tr>
-      <w:tr>
-        <w:tc>
-          <w:tcPr>
-            <w:tcW w:type="dxa" w:w="2745"/>
-          </w:tcPr>
-          <w:p>
-            <w:pPr>
-              <w:spacing w:after="0"/>
-            </w:pPr>
-            <w:r>
-              <w:rPr>
-                <w:rFonts w:ascii="Sarabun" w:hAnsi="Sarabun" w:cs="Sarabun" w:eastAsia="Sarabun"/>
-                <w:sz w:val="20"/>
-                <w:szCs w:val="20"/>
-              </w:rPr>
-              <w:t>30 ต.ค.</w:t>
-            </w:r>
-          </w:p>
-        </w:tc>
-        <w:tc>
-          <w:tcPr>
-            <w:tcW w:type="dxa" w:w="6666"/>
-          </w:tcPr>
-          <w:p>
-            <w:pPr>
-              <w:spacing w:after="0"/>
-            </w:pPr>
-            <w:r>
-              <w:rPr>
-                <w:rFonts w:ascii="Sarabun" w:hAnsi="Sarabun" w:cs="Sarabun" w:eastAsia="Sarabun"/>
-                <w:sz w:val="20"/>
-                <w:szCs w:val="20"/>
-              </w:rPr>
-              <w:t>ส่งชิ้นงานและนำเสนอ</w:t>
-            </w:r>
-          </w:p>
-        </w:tc>
-      </w:tr>
-    </w:tbl>
-    <w:p>
-      <w:pPr>
-        <w:spacing w:after="40"/>
-      </w:pPr>
-    </w:p>
-    <w:p>
-      <w:pPr>
-        <w:pStyle w:val="Heading2"/>
-      </w:pPr>
-      <w:r>
-        <w:rPr>
-          <w:rFonts w:ascii="Sarabun" w:hAnsi="Sarabun" w:cs="Sarabun" w:eastAsia="Sarabun"/>
-        </w:rPr>
-        <w:t>11. การแบ่งหน้าที่</w:t>
-      </w:r>
-    </w:p>
-    <w:tbl>
-      <w:tblPr>
-        <w:tblStyle w:val="TableGrid"/>
-        <w:tblW w:type="auto" w:w="0"/>
-        <w:jc w:val="center"/>
-        <w:tblLayout w:type="fixed"/>
-        <w:tblLook w:firstColumn="1" w:firstRow="1" w:lastColumn="0" w:lastRow="0" w:noHBand="0" w:noVBand="1" w:val="04A0"/>
-      </w:tblPr>
-      <w:tblGrid>
-        <w:gridCol w:w="4706"/>
-        <w:gridCol w:w="4706"/>
-      </w:tblGrid>
-      <w:tr>
-        <w:tc>
-          <w:tcPr>
-            <w:tcW w:type="dxa" w:w="2896"/>
-            <w:shd w:val="clear" w:color="auto" w:fill="EDE9FE"/>
-          </w:tcPr>
-          <w:p>
-            <w:pPr>
-              <w:spacing w:after="0"/>
-            </w:pPr>
-            <w:r>
-              <w:rPr>
-                <w:rFonts w:ascii="Sarabun" w:hAnsi="Sarabun" w:cs="Sarabun" w:eastAsia="Sarabun"/>
-                <w:b/>
-                <w:sz w:val="20"/>
-                <w:szCs w:val="20"/>
-                <w:bCs/>
-              </w:rPr>
-              <w:t>สมาชิก</w:t>
-            </w:r>
-          </w:p>
-        </w:tc>
-        <w:tc>
-          <w:tcPr>
-            <w:tcW w:type="dxa" w:w="6515"/>
-            <w:shd w:val="clear" w:color="auto" w:fill="EDE9FE"/>
-          </w:tcPr>
-          <w:p>
-            <w:pPr>
-              <w:spacing w:after="0"/>
-            </w:pPr>
-            <w:r>
-              <w:rPr>
-                <w:rFonts w:ascii="Sarabun" w:hAnsi="Sarabun" w:cs="Sarabun" w:eastAsia="Sarabun"/>
-                <w:b/>
-                <w:sz w:val="20"/>
-                <w:szCs w:val="20"/>
-                <w:bCs/>
-              </w:rPr>
-              <w:t>หน้าที่หลัก</w:t>
-            </w:r>
-          </w:p>
-        </w:tc>
-      </w:tr>
-      <w:tr>
-        <w:tc>
-          <w:tcPr>
-            <w:tcW w:type="dxa" w:w="2896"/>
-          </w:tcPr>
-          <w:p>
-            <w:pPr>
-              <w:spacing w:after="0"/>
-            </w:pPr>
-            <w:r>
-              <w:rPr>
-                <w:rFonts w:ascii="Sarabun" w:hAnsi="Sarabun" w:cs="Sarabun" w:eastAsia="Sarabun"/>
-                <w:sz w:val="20"/>
-                <w:szCs w:val="20"/>
-              </w:rPr>
-              <w:t>[ชื่อ]</w:t>
-            </w:r>
-          </w:p>
-        </w:tc>
-        <w:tc>
-          <w:tcPr>
-            <w:tcW w:type="dxa" w:w="6515"/>
-          </w:tcPr>
-          <w:p>
-            <w:pPr>
-              <w:spacing w:after="0"/>
-            </w:pPr>
-            <w:r>
-              <w:rPr>
-                <w:rFonts w:ascii="Sarabun" w:hAnsi="Sarabun" w:cs="Sarabun" w:eastAsia="Sarabun"/>
-                <w:sz w:val="20"/>
-                <w:szCs w:val="20"/>
-              </w:rPr>
-              <w:t>[เช่น ออกแบบวงจรเกมและการเชื่อมบอร์ด]</w:t>
-            </w:r>
-          </w:p>
-        </w:tc>
-      </w:tr>
-      <w:tr>
-        <w:tc>
-          <w:tcPr>
-            <w:tcW w:type="dxa" w:w="2896"/>
-          </w:tcPr>
-          <w:p>
-            <w:pPr>
-              <w:spacing w:after="0"/>
-            </w:pPr>
-            <w:r>
-              <w:rPr>
-                <w:rFonts w:ascii="Sarabun" w:hAnsi="Sarabun" w:cs="Sarabun" w:eastAsia="Sarabun"/>
-                <w:sz w:val="20"/>
-                <w:szCs w:val="20"/>
-              </w:rPr>
-              <w:t>[ชื่อ]</w:t>
-            </w:r>
-          </w:p>
-        </w:tc>
-        <w:tc>
-          <w:tcPr>
-            <w:tcW w:type="dxa" w:w="6515"/>
-          </w:tcPr>
-          <w:p>
-            <w:pPr>
-              <w:spacing w:after="0"/>
-            </w:pPr>
-            <w:r>
-              <w:rPr>
-                <w:rFonts w:ascii="Sarabun" w:hAnsi="Sarabun" w:cs="Sarabun" w:eastAsia="Sarabun"/>
-                <w:sz w:val="20"/>
-                <w:szCs w:val="20"/>
-              </w:rPr>
-              <w:t>[เช่น ระบบภาพ/สื่อจากแฟลช]</w:t>
-            </w:r>
-          </w:p>
-        </w:tc>
-      </w:tr>
-      <w:tr>
-        <w:tc>
-          <w:tcPr>
-            <w:tcW w:type="dxa" w:w="2896"/>
-          </w:tcPr>
-          <w:p>
-            <w:pPr>
-              <w:spacing w:after="0"/>
-            </w:pPr>
-            <w:r>
-              <w:rPr>
-                <w:rFonts w:ascii="Sarabun" w:hAnsi="Sarabun" w:cs="Sarabun" w:eastAsia="Sarabun"/>
-                <w:sz w:val="20"/>
-                <w:szCs w:val="20"/>
-              </w:rPr>
-              <w:t>[ชื่อ]</w:t>
-            </w:r>
-          </w:p>
-        </w:tc>
-        <w:tc>
-          <w:tcPr>
-            <w:tcW w:type="dxa" w:w="6515"/>
-          </w:tcPr>
-          <w:p>
-            <w:pPr>
-              <w:spacing w:after="0"/>
-            </w:pPr>
-            <w:r>
-              <w:rPr>
-                <w:rFonts w:ascii="Sarabun" w:hAnsi="Sarabun" w:cs="Sarabun" w:eastAsia="Sarabun"/>
-                <w:sz w:val="20"/>
-                <w:szCs w:val="20"/>
-              </w:rPr>
-              <w:t>[เช่น ทดสอบบนบอร์ด, ออกแบบภารกิจ CHAOS]</w:t>
-            </w:r>
-          </w:p>
-        </w:tc>
-      </w:tr>
-      <w:tr>
-        <w:tc>
-          <w:tcPr>
-            <w:tcW w:type="dxa" w:w="2896"/>
-          </w:tcPr>
-          <w:p>
-            <w:pPr>
-              <w:spacing w:after="0"/>
-            </w:pPr>
-            <w:r>
-              <w:rPr>
-                <w:rFonts w:ascii="Sarabun" w:hAnsi="Sarabun" w:cs="Sarabun" w:eastAsia="Sarabun"/>
-                <w:sz w:val="20"/>
-                <w:szCs w:val="20"/>
-              </w:rPr>
-              <w:t>[ชื่อ]</w:t>
-            </w:r>
-          </w:p>
-        </w:tc>
-        <w:tc>
-          <w:tcPr>
-            <w:tcW w:type="dxa" w:w="6515"/>
-          </w:tcPr>
-          <w:p>
-            <w:pPr>
-              <w:spacing w:after="0"/>
-            </w:pPr>
-            <w:r>
-              <w:rPr>
-                <w:rFonts w:ascii="Sarabun" w:hAnsi="Sarabun" w:cs="Sarabun" w:eastAsia="Sarabun"/>
-                <w:sz w:val="20"/>
-                <w:szCs w:val="20"/>
-              </w:rPr>
-              <w:t>[เช่น เอกสาร, Brochure]</w:t>
-            </w:r>
-          </w:p>
-        </w:tc>
-      </w:tr>
-      <w:tr>
-        <w:tc>
-          <w:tcPr>
-            <w:tcW w:type="dxa" w:w="2896"/>
-          </w:tcPr>
-          <w:p>
-            <w:pPr>
-              <w:spacing w:after="0"/>
-            </w:pPr>
-            <w:r>
-              <w:rPr>
-                <w:rFonts w:ascii="Sarabun" w:hAnsi="Sarabun" w:cs="Sarabun" w:eastAsia="Sarabun"/>
-                <w:sz w:val="20"/>
-                <w:szCs w:val="20"/>
-              </w:rPr>
-              <w:t>[ชื่อ]</w:t>
-            </w:r>
-          </w:p>
-        </w:tc>
-        <w:tc>
-          <w:tcPr>
-            <w:tcW w:type="dxa" w:w="6515"/>
-          </w:tcPr>
-          <w:p>
-            <w:pPr>
-              <w:spacing w:after="0"/>
-            </w:pPr>
-            <w:r>
-              <w:rPr>
-                <w:rFonts w:ascii="Sarabun" w:hAnsi="Sarabun" w:cs="Sarabun" w:eastAsia="Sarabun"/>
-                <w:sz w:val="20"/>
-                <w:szCs w:val="20"/>
-              </w:rPr>
-              <w:t>[เช่น วิดีโอแนะนำชิ้นงาน]</w:t>
-            </w:r>
-          </w:p>
-        </w:tc>
-      </w:tr>
-    </w:tbl>
-    <w:p>
-      <w:pPr>
-        <w:spacing w:after="40"/>
-      </w:pPr>
-    </w:p>
     <w:sectPr>
+      <w:footerReference w:type="default" r:id="rId9"/>
       <w:pgSz w:w="11906" w:h="16838"/>
       <w:pgMar w:top="1134" w:right="1247" w:bottom="1134" w:left="1247" w:header="720" w:footer="720" w:gutter="0"/>
       <w:cols w:space="720"/>
+      <w:titlePg/>
       <w:docGrid w:linePitch="360"/>
     </w:sectPr>
   </w:body>
 </w:document>
+</file>
+
+<file path=word/footer1.xml><?xml version="1.0" encoding="utf-8"?>
+<w:ftr xmlns:m="http://schemas.openxmlformats.org/officeDocument/2006/math" xmlns:mc="http://schemas.openxmlformats.org/markup-compatibility/2006" xmlns:mo="http://schemas.microsoft.com/office/mac/office/2008/main" xmlns:mv="urn:schemas-microsoft-com:mac:vml" xmlns:o="urn:schemas-microsoft-com:office:office" xmlns:r="http://schemas.openxmlformats.org/officeDocument/2006/relationships" xmlns:v="urn:schemas-microsoft-com:vml" xmlns:w10="urn:schemas-microsoft-com:office:word" xmlns:w14="http://schemas.microsoft.com/office/word/2010/wordml" xmlns:w="http://schemas.openxmlformats.org/wordprocessingml/2006/main" xmlns:wne="http://schemas.microsoft.com/office/word/2006/wordml" xmlns:wp14="http://schemas.microsoft.com/office/word/2010/wordprocessingDrawing" xmlns:wp="http://schemas.openxmlformats.org/drawingml/2006/wordprocessingDrawing" xmlns:wpc="http://schemas.microsoft.com/office/word/2010/wordprocessingCanvas" xmlns:wpg="http://schemas.microsoft.com/office/word/2010/wordprocessingGroup" xmlns:wpi="http://schemas.microsoft.com/office/word/2010/wordprocessingInk" xmlns:wps="http://schemas.microsoft.com/office/word/2010/wordprocessingShape" mc:Ignorable="w14 wp14">
+  <w:p>
+    <w:pPr>
+      <w:pStyle w:val="Footer"/>
+      <w:jc w:val="center"/>
+    </w:pPr>
+    <w:r>
+      <w:rPr>
+        <w:rFonts w:ascii="Sarabun" w:hAnsi="Sarabun" w:cs="Sarabun" w:eastAsia="Sarabun"/>
+        <w:sz w:val="20"/>
+        <w:szCs w:val="20"/>
+      </w:rPr>
+      <w:fldChar w:fldCharType="begin"/>
+    </w:r>
+    <w:r>
+      <w:rPr>
+        <w:rFonts w:ascii="Sarabun" w:hAnsi="Sarabun" w:cs="Sarabun" w:eastAsia="Sarabun"/>
+        <w:sz w:val="20"/>
+        <w:szCs w:val="20"/>
+      </w:rPr>
+      <w:instrText xml:space="preserve">PAGE</w:instrText>
+    </w:r>
+    <w:r>
+      <w:rPr>
+        <w:rFonts w:ascii="Sarabun" w:hAnsi="Sarabun" w:cs="Sarabun" w:eastAsia="Sarabun"/>
+        <w:sz w:val="20"/>
+        <w:szCs w:val="20"/>
+      </w:rPr>
+      <w:fldChar w:fldCharType="separate"/>
+    </w:r>
+    <w:r>
+      <w:rPr>
+        <w:rFonts w:ascii="Sarabun" w:hAnsi="Sarabun" w:cs="Sarabun" w:eastAsia="Sarabun"/>
+        <w:sz w:val="20"/>
+        <w:szCs w:val="20"/>
+      </w:rPr>
+      <w:t>1</w:t>
+    </w:r>
+    <w:r>
+      <w:rPr>
+        <w:rFonts w:ascii="Sarabun" w:hAnsi="Sarabun" w:cs="Sarabun" w:eastAsia="Sarabun"/>
+        <w:sz w:val="20"/>
+        <w:szCs w:val="20"/>
+      </w:rPr>
+      <w:fldChar w:fldCharType="end"/>
+    </w:r>
+  </w:p>
+</w:ftr>
 </file>
 
 <file path=word/numbering.xml><?xml version="1.0" encoding="utf-8"?>
@@ -2747,6 +2100,12 @@
     </w:lvlOverride>
   </w:num>
   <w:num w:numId="15">
+    <w:abstractNumId w:val="7"/>
+    <w:lvlOverride w:ilvl="0">
+      <w:startOverride w:val="1"/>
+    </w:lvlOverride>
+  </w:num>
+  <w:num w:numId="16">
     <w:abstractNumId w:val="7"/>
     <w:lvlOverride w:ilvl="0">
       <w:startOverride w:val="1"/>
@@ -2986,9 +2345,10 @@
       <w:rFonts w:asciiTheme="majorHAnsi" w:eastAsiaTheme="majorEastAsia" w:hAnsiTheme="majorHAnsi" w:cstheme="majorBidi" w:ascii="Sarabun" w:hAnsi="Sarabun" w:cs="Sarabun" w:eastAsia="Sarabun"/>
       <w:b/>
       <w:bCs/>
-      <w:color w:val="4C1D95"/>
-      <w:sz w:val="44"/>
-      <w:szCs w:val="44"/>
+      <w:i w:val="0"/>
+      <w:color w:val="000000"/>
+      <w:sz w:val="36"/>
+      <w:szCs w:val="36"/>
     </w:rPr>
   </w:style>
   <w:style w:type="paragraph" w:styleId="Heading2">
@@ -3010,9 +2370,10 @@
       <w:rFonts w:asciiTheme="majorHAnsi" w:eastAsiaTheme="majorEastAsia" w:hAnsiTheme="majorHAnsi" w:cstheme="majorBidi" w:ascii="Sarabun" w:hAnsi="Sarabun" w:cs="Sarabun" w:eastAsia="Sarabun"/>
       <w:b/>
       <w:bCs/>
-      <w:color w:val="4C1D95"/>
-      <w:sz w:val="34"/>
-      <w:szCs w:val="34"/>
+      <w:i w:val="0"/>
+      <w:color w:val="000000"/>
+      <w:sz w:val="36"/>
+      <w:szCs w:val="36"/>
     </w:rPr>
   </w:style>
   <w:style w:type="paragraph" w:styleId="Heading3">
@@ -3034,7 +2395,8 @@
       <w:rFonts w:asciiTheme="majorHAnsi" w:eastAsiaTheme="majorEastAsia" w:hAnsiTheme="majorHAnsi" w:cstheme="majorBidi" w:ascii="Sarabun" w:hAnsi="Sarabun" w:cs="Sarabun" w:eastAsia="Sarabun"/>
       <w:b/>
       <w:bCs/>
-      <w:color w:val="1D2433"/>
+      <w:i w:val="0"/>
+      <w:color w:val="000000"/>
       <w:sz w:val="28"/>
       <w:szCs w:val="28"/>
     </w:rPr>
@@ -3059,9 +2421,9 @@
       <w:rFonts w:asciiTheme="majorHAnsi" w:eastAsiaTheme="majorEastAsia" w:hAnsiTheme="majorHAnsi" w:cstheme="majorBidi" w:ascii="Sarabun" w:hAnsi="Sarabun" w:cs="Sarabun" w:eastAsia="Sarabun"/>
       <w:b/>
       <w:bCs/>
-      <w:i/>
+      <w:i w:val="0"/>
       <w:iCs/>
-      <w:color w:val="1D2433"/>
+      <w:color w:val="000000"/>
       <w:sz w:val="24"/>
       <w:szCs w:val="24"/>
     </w:rPr>

</xml_diff>